<commit_message>
Caso de uso Acompanhar Pedido corrigido. Close #18
</commit_message>
<xml_diff>
--- a/Requisitos/CSU04 - Acompanhar Pedido.docx
+++ b/Requisitos/CSU04 - Acompanhar Pedido.docx
@@ -1,9 +1,10 @@
 
 <file path=word/document.xml><?xml version="1.0" encoding="utf-8"?>
-<w:document xmlns:wpc="http://schemas.microsoft.com/office/word/2010/wordprocessingCanvas" xmlns:cx="http://schemas.microsoft.com/office/drawing/2014/chartex" xmlns:cx1="http://schemas.microsoft.com/office/drawing/2015/9/8/chartex" xmlns:cx2="http://schemas.microsoft.com/office/drawing/2015/10/21/chartex" xmlns:cx3="http://schemas.microsoft.com/office/drawing/2016/5/9/chartex" xmlns:cx4="http://schemas.microsoft.com/office/drawing/2016/5/10/chartex" xmlns:cx5="http://schemas.microsoft.com/office/drawing/2016/5/11/chartex" xmlns:cx6="http://schemas.microsoft.com/office/drawing/2016/5/12/chartex" xmlns:cx7="http://schemas.microsoft.com/office/drawing/2016/5/13/chartex" xmlns:cx8="http://schemas.microsoft.com/office/drawing/2016/5/14/chartex" xmlns:mc="http://schemas.openxmlformats.org/markup-compatibility/2006" xmlns:aink="http://schemas.microsoft.com/office/drawing/2016/ink" xmlns:am3d="http://schemas.microsoft.com/office/drawing/2017/model3d" xmlns:o="urn:schemas-microsoft-com:office:office" xmlns:r="http://schemas.openxmlformats.org/officeDocument/2006/relationships" xmlns:m="http://schemas.openxmlformats.org/officeDocument/2006/math" xmlns:v="urn:schemas-microsoft-com:vml" xmlns:wp14="http://schemas.microsoft.com/office/word/2010/wordprocessingDrawing" xmlns:wp="http://schemas.openxmlformats.org/drawingml/2006/wordprocessingDrawing" xmlns:w10="urn:schemas-microsoft-com:office:word" xmlns:w="http://schemas.openxmlformats.org/wordprocessingml/2006/main" xmlns:w14="http://schemas.microsoft.com/office/word/2010/wordml" xmlns:w15="http://schemas.microsoft.com/office/word/2012/wordml" xmlns:w16cex="http://schemas.microsoft.com/office/word/2018/wordml/cex" xmlns:w16cid="http://schemas.microsoft.com/office/word/2016/wordml/cid" xmlns:w16="http://schemas.microsoft.com/office/word/2018/wordml" xmlns:w16se="http://schemas.microsoft.com/office/word/2015/wordml/symex" xmlns:wpg="http://schemas.microsoft.com/office/word/2010/wordprocessingGroup" xmlns:wpi="http://schemas.microsoft.com/office/word/2010/wordprocessingInk" xmlns:wne="http://schemas.microsoft.com/office/word/2006/wordml" xmlns:wps="http://schemas.microsoft.com/office/word/2010/wordprocessingShape" mc:Ignorable="w14 w15 w16se w16cid w16 w16cex wp14">
+<w:document xmlns:o="urn:schemas-microsoft-com:office:office" xmlns:r="http://schemas.openxmlformats.org/officeDocument/2006/relationships" xmlns:v="urn:schemas-microsoft-com:vml" xmlns:w="http://schemas.openxmlformats.org/wordprocessingml/2006/main" xmlns:w10="urn:schemas-microsoft-com:office:word" xmlns:wp="http://schemas.openxmlformats.org/drawingml/2006/wordprocessingDrawing" xmlns:wps="http://schemas.microsoft.com/office/word/2010/wordprocessingShape" xmlns:wpg="http://schemas.microsoft.com/office/word/2010/wordprocessingGroup" xmlns:mc="http://schemas.openxmlformats.org/markup-compatibility/2006" xmlns:wp14="http://schemas.microsoft.com/office/word/2010/wordprocessingDrawing" xmlns:w14="http://schemas.microsoft.com/office/word/2010/wordml" xmlns:w15="http://schemas.microsoft.com/office/word/2012/wordml" mc:Ignorable="w14 wp14 w15">
   <w:body>
     <w:p>
       <w:pPr>
+        <w:pStyle w:val="Normal"/>
         <w:jc w:val="center"/>
         <w:rPr>
           <w:b/>
@@ -31,6 +32,7 @@
     </w:p>
     <w:p>
       <w:pPr>
+        <w:pStyle w:val="Normal"/>
         <w:jc w:val="center"/>
         <w:rPr>
           <w:b/>
@@ -38,21 +40,30 @@
           <w:szCs w:val="28"/>
         </w:rPr>
       </w:pPr>
+      <w:r>
+        <w:rPr>
+          <w:b/>
+          <w:sz w:val="28"/>
+          <w:szCs w:val="28"/>
+        </w:rPr>
+      </w:r>
     </w:p>
     <w:p>
       <w:pPr>
-        <w:pStyle w:val="Ttulo1"/>
+        <w:pStyle w:val="Heading1"/>
         <w:numPr>
           <w:ilvl w:val="0"/>
           <w:numId w:val="1"/>
         </w:numPr>
+        <w:rPr/>
       </w:pPr>
       <w:r>
+        <w:rPr/>
         <w:t xml:space="preserve">Seção: </w:t>
       </w:r>
       <w:r>
         <w:rPr>
-          <w:b w:val="0"/>
+          <w:b w:val="false"/>
         </w:rPr>
         <w:t>Principal</w:t>
       </w:r>
@@ -61,27 +72,39 @@
       <w:tblPr>
         <w:tblStyle w:val="a"/>
         <w:tblW w:w="10330" w:type="dxa"/>
+        <w:jc w:val="left"/>
         <w:tblInd w:w="-70" w:type="dxa"/>
         <w:tblLayout w:type="fixed"/>
-        <w:tblLook w:val="0000" w:firstRow="0" w:lastRow="0" w:firstColumn="0" w:lastColumn="0" w:noHBand="0" w:noVBand="0"/>
+        <w:tblCellMar>
+          <w:top w:w="0" w:type="dxa"/>
+          <w:left w:w="108" w:type="dxa"/>
+          <w:bottom w:w="0" w:type="dxa"/>
+          <w:right w:w="108" w:type="dxa"/>
+        </w:tblCellMar>
+        <w:tblLook w:val="0000" w:noHBand="0" w:noVBand="0" w:firstColumn="0" w:lastRow="0" w:lastColumn="0" w:firstRow="0"/>
       </w:tblPr>
       <w:tblGrid>
-        <w:gridCol w:w="2905"/>
+        <w:gridCol w:w="2904"/>
         <w:gridCol w:w="7425"/>
       </w:tblGrid>
       <w:tr>
-        <w:tc>
-          <w:tcPr>
-            <w:tcW w:w="2905" w:type="dxa"/>
-            <w:tcBorders>
-              <w:top w:val="single" w:sz="4" w:space="0" w:color="000000"/>
-              <w:left w:val="single" w:sz="4" w:space="0" w:color="000000"/>
-              <w:bottom w:val="single" w:sz="4" w:space="0" w:color="000000"/>
-              <w:right w:val="single" w:sz="4" w:space="0" w:color="000000"/>
-            </w:tcBorders>
-            <w:shd w:val="clear" w:color="auto" w:fill="auto"/>
-          </w:tcPr>
-          <w:p>
+        <w:trPr/>
+        <w:tc>
+          <w:tcPr>
+            <w:tcW w:w="2904" w:type="dxa"/>
+            <w:tcBorders>
+              <w:top w:val="single" w:sz="4" w:space="0" w:color="000000"/>
+              <w:left w:val="single" w:sz="4" w:space="0" w:color="000000"/>
+              <w:bottom w:val="single" w:sz="4" w:space="0" w:color="000000"/>
+              <w:right w:val="single" w:sz="4" w:space="0" w:color="000000"/>
+            </w:tcBorders>
+            <w:shd w:color="auto" w:fill="auto" w:val="clear"/>
+          </w:tcPr>
+          <w:p>
+            <w:pPr>
+              <w:pStyle w:val="Normal"/>
+              <w:rPr/>
+            </w:pPr>
             <w:r>
               <w:rPr>
                 <w:b/>
@@ -101,41 +124,48 @@
               <w:bottom w:val="single" w:sz="4" w:space="0" w:color="000000"/>
               <w:right w:val="single" w:sz="4" w:space="0" w:color="000000"/>
             </w:tcBorders>
-            <w:shd w:val="clear" w:color="auto" w:fill="auto"/>
-          </w:tcPr>
-          <w:p>
-            <w:pPr>
-              <w:pStyle w:val="Ttulo1"/>
+            <w:shd w:color="auto" w:fill="auto" w:val="clear"/>
+          </w:tcPr>
+          <w:p>
+            <w:pPr>
+              <w:pStyle w:val="Heading1"/>
               <w:numPr>
                 <w:ilvl w:val="0"/>
                 <w:numId w:val="1"/>
               </w:numPr>
-            </w:pPr>
-            <w:r>
-              <w:rPr>
-                <w:b w:val="0"/>
+              <w:rPr/>
+            </w:pPr>
+            <w:r>
+              <w:rPr>
+                <w:b w:val="false"/>
               </w:rPr>
               <w:t>60 (</w:t>
             </w:r>
             <w:r>
+              <w:rPr/>
               <w:t>Risco Baixo e Prioridade Alta)</w:t>
             </w:r>
           </w:p>
         </w:tc>
       </w:tr>
       <w:tr>
-        <w:tc>
-          <w:tcPr>
-            <w:tcW w:w="2905" w:type="dxa"/>
-            <w:tcBorders>
-              <w:top w:val="single" w:sz="4" w:space="0" w:color="000000"/>
-              <w:left w:val="single" w:sz="4" w:space="0" w:color="000000"/>
-              <w:bottom w:val="single" w:sz="4" w:space="0" w:color="000000"/>
-              <w:right w:val="single" w:sz="4" w:space="0" w:color="000000"/>
-            </w:tcBorders>
-            <w:shd w:val="clear" w:color="auto" w:fill="auto"/>
-          </w:tcPr>
-          <w:p>
+        <w:trPr/>
+        <w:tc>
+          <w:tcPr>
+            <w:tcW w:w="2904" w:type="dxa"/>
+            <w:tcBorders>
+              <w:top w:val="single" w:sz="4" w:space="0" w:color="000000"/>
+              <w:left w:val="single" w:sz="4" w:space="0" w:color="000000"/>
+              <w:bottom w:val="single" w:sz="4" w:space="0" w:color="000000"/>
+              <w:right w:val="single" w:sz="4" w:space="0" w:color="000000"/>
+            </w:tcBorders>
+            <w:shd w:color="auto" w:fill="auto" w:val="clear"/>
+          </w:tcPr>
+          <w:p>
+            <w:pPr>
+              <w:pStyle w:val="Normal"/>
+              <w:rPr/>
+            </w:pPr>
             <w:r>
               <w:rPr>
                 <w:b/>
@@ -155,9 +185,13 @@
               <w:bottom w:val="single" w:sz="4" w:space="0" w:color="000000"/>
               <w:right w:val="single" w:sz="4" w:space="0" w:color="000000"/>
             </w:tcBorders>
-            <w:shd w:val="clear" w:color="auto" w:fill="auto"/>
-          </w:tcPr>
-          <w:p>
+            <w:shd w:color="auto" w:fill="auto" w:val="clear"/>
+          </w:tcPr>
+          <w:p>
+            <w:pPr>
+              <w:pStyle w:val="Normal"/>
+              <w:rPr/>
+            </w:pPr>
             <w:r>
               <w:rPr>
                 <w:sz w:val="28"/>
@@ -169,18 +203,23 @@
         </w:tc>
       </w:tr>
       <w:tr>
-        <w:tc>
-          <w:tcPr>
-            <w:tcW w:w="2905" w:type="dxa"/>
-            <w:tcBorders>
-              <w:top w:val="single" w:sz="4" w:space="0" w:color="000000"/>
-              <w:left w:val="single" w:sz="4" w:space="0" w:color="000000"/>
-              <w:bottom w:val="single" w:sz="4" w:space="0" w:color="000000"/>
-              <w:right w:val="single" w:sz="4" w:space="0" w:color="000000"/>
-            </w:tcBorders>
-            <w:shd w:val="clear" w:color="auto" w:fill="auto"/>
-          </w:tcPr>
-          <w:p>
+        <w:trPr/>
+        <w:tc>
+          <w:tcPr>
+            <w:tcW w:w="2904" w:type="dxa"/>
+            <w:tcBorders>
+              <w:top w:val="single" w:sz="4" w:space="0" w:color="000000"/>
+              <w:left w:val="single" w:sz="4" w:space="0" w:color="000000"/>
+              <w:bottom w:val="single" w:sz="4" w:space="0" w:color="000000"/>
+              <w:right w:val="single" w:sz="4" w:space="0" w:color="000000"/>
+            </w:tcBorders>
+            <w:shd w:color="auto" w:fill="auto" w:val="clear"/>
+          </w:tcPr>
+          <w:p>
+            <w:pPr>
+              <w:pStyle w:val="Normal"/>
+              <w:rPr/>
+            </w:pPr>
             <w:r>
               <w:rPr>
                 <w:b/>
@@ -200,9 +239,13 @@
               <w:bottom w:val="single" w:sz="4" w:space="0" w:color="000000"/>
               <w:right w:val="single" w:sz="4" w:space="0" w:color="000000"/>
             </w:tcBorders>
-            <w:shd w:val="clear" w:color="auto" w:fill="auto"/>
-          </w:tcPr>
-          <w:p>
+            <w:shd w:color="auto" w:fill="auto" w:val="clear"/>
+          </w:tcPr>
+          <w:p>
+            <w:pPr>
+              <w:pStyle w:val="Normal"/>
+              <w:rPr/>
+            </w:pPr>
             <w:r>
               <w:rPr>
                 <w:sz w:val="28"/>
@@ -214,18 +257,23 @@
         </w:tc>
       </w:tr>
       <w:tr>
-        <w:tc>
-          <w:tcPr>
-            <w:tcW w:w="2905" w:type="dxa"/>
-            <w:tcBorders>
-              <w:top w:val="single" w:sz="4" w:space="0" w:color="000000"/>
-              <w:left w:val="single" w:sz="4" w:space="0" w:color="000000"/>
-              <w:bottom w:val="single" w:sz="4" w:space="0" w:color="000000"/>
-              <w:right w:val="single" w:sz="4" w:space="0" w:color="000000"/>
-            </w:tcBorders>
-            <w:shd w:val="clear" w:color="auto" w:fill="auto"/>
-          </w:tcPr>
-          <w:p>
+        <w:trPr/>
+        <w:tc>
+          <w:tcPr>
+            <w:tcW w:w="2904" w:type="dxa"/>
+            <w:tcBorders>
+              <w:top w:val="single" w:sz="4" w:space="0" w:color="000000"/>
+              <w:left w:val="single" w:sz="4" w:space="0" w:color="000000"/>
+              <w:bottom w:val="single" w:sz="4" w:space="0" w:color="000000"/>
+              <w:right w:val="single" w:sz="4" w:space="0" w:color="000000"/>
+            </w:tcBorders>
+            <w:shd w:color="auto" w:fill="auto" w:val="clear"/>
+          </w:tcPr>
+          <w:p>
+            <w:pPr>
+              <w:pStyle w:val="Normal"/>
+              <w:rPr/>
+            </w:pPr>
             <w:r>
               <w:rPr>
                 <w:b/>
@@ -245,9 +293,13 @@
               <w:bottom w:val="single" w:sz="4" w:space="0" w:color="000000"/>
               <w:right w:val="single" w:sz="4" w:space="0" w:color="000000"/>
             </w:tcBorders>
-            <w:shd w:val="clear" w:color="auto" w:fill="auto"/>
-          </w:tcPr>
-          <w:p>
+            <w:shd w:color="auto" w:fill="auto" w:val="clear"/>
+          </w:tcPr>
+          <w:p>
+            <w:pPr>
+              <w:pStyle w:val="Normal"/>
+              <w:rPr/>
+            </w:pPr>
             <w:r>
               <w:rPr>
                 <w:sz w:val="28"/>
@@ -259,18 +311,23 @@
         </w:tc>
       </w:tr>
       <w:tr>
-        <w:tc>
-          <w:tcPr>
-            <w:tcW w:w="2905" w:type="dxa"/>
-            <w:tcBorders>
-              <w:top w:val="single" w:sz="4" w:space="0" w:color="000000"/>
-              <w:left w:val="single" w:sz="4" w:space="0" w:color="000000"/>
-              <w:bottom w:val="single" w:sz="4" w:space="0" w:color="000000"/>
-              <w:right w:val="single" w:sz="4" w:space="0" w:color="000000"/>
-            </w:tcBorders>
-            <w:shd w:val="clear" w:color="auto" w:fill="auto"/>
-          </w:tcPr>
-          <w:p>
+        <w:trPr/>
+        <w:tc>
+          <w:tcPr>
+            <w:tcW w:w="2904" w:type="dxa"/>
+            <w:tcBorders>
+              <w:top w:val="single" w:sz="4" w:space="0" w:color="000000"/>
+              <w:left w:val="single" w:sz="4" w:space="0" w:color="000000"/>
+              <w:bottom w:val="single" w:sz="4" w:space="0" w:color="000000"/>
+              <w:right w:val="single" w:sz="4" w:space="0" w:color="000000"/>
+            </w:tcBorders>
+            <w:shd w:color="auto" w:fill="auto" w:val="clear"/>
+          </w:tcPr>
+          <w:p>
+            <w:pPr>
+              <w:pStyle w:val="Normal"/>
+              <w:rPr/>
+            </w:pPr>
             <w:r>
               <w:rPr>
                 <w:b/>
@@ -290,10 +347,11 @@
               <w:bottom w:val="single" w:sz="4" w:space="0" w:color="000000"/>
               <w:right w:val="single" w:sz="4" w:space="0" w:color="000000"/>
             </w:tcBorders>
-            <w:shd w:val="clear" w:color="auto" w:fill="auto"/>
-          </w:tcPr>
-          <w:p>
-            <w:pPr>
+            <w:shd w:color="auto" w:fill="auto" w:val="clear"/>
+          </w:tcPr>
+          <w:p>
+            <w:pPr>
+              <w:pStyle w:val="Normal"/>
               <w:rPr>
                 <w:color w:val="FF0000"/>
                 <w:sz w:val="28"/>
@@ -328,18 +386,23 @@
         </w:tc>
       </w:tr>
       <w:tr>
-        <w:tc>
-          <w:tcPr>
-            <w:tcW w:w="2905" w:type="dxa"/>
-            <w:tcBorders>
-              <w:top w:val="single" w:sz="4" w:space="0" w:color="000000"/>
-              <w:left w:val="single" w:sz="4" w:space="0" w:color="000000"/>
-              <w:bottom w:val="single" w:sz="4" w:space="0" w:color="000000"/>
-              <w:right w:val="single" w:sz="4" w:space="0" w:color="000000"/>
-            </w:tcBorders>
-            <w:shd w:val="clear" w:color="auto" w:fill="auto"/>
-          </w:tcPr>
-          <w:p>
+        <w:trPr/>
+        <w:tc>
+          <w:tcPr>
+            <w:tcW w:w="2904" w:type="dxa"/>
+            <w:tcBorders>
+              <w:top w:val="single" w:sz="4" w:space="0" w:color="000000"/>
+              <w:left w:val="single" w:sz="4" w:space="0" w:color="000000"/>
+              <w:bottom w:val="single" w:sz="4" w:space="0" w:color="000000"/>
+              <w:right w:val="single" w:sz="4" w:space="0" w:color="000000"/>
+            </w:tcBorders>
+            <w:shd w:color="auto" w:fill="auto" w:val="clear"/>
+          </w:tcPr>
+          <w:p>
+            <w:pPr>
+              <w:pStyle w:val="Normal"/>
+              <w:rPr/>
+            </w:pPr>
             <w:r>
               <w:rPr>
                 <w:b/>
@@ -359,9 +422,13 @@
               <w:bottom w:val="single" w:sz="4" w:space="0" w:color="000000"/>
               <w:right w:val="single" w:sz="4" w:space="0" w:color="000000"/>
             </w:tcBorders>
-            <w:shd w:val="clear" w:color="auto" w:fill="auto"/>
-          </w:tcPr>
-          <w:p>
+            <w:shd w:color="auto" w:fill="auto" w:val="clear"/>
+          </w:tcPr>
+          <w:p>
+            <w:pPr>
+              <w:pStyle w:val="Normal"/>
+              <w:rPr/>
+            </w:pPr>
             <w:r>
               <w:rPr>
                 <w:sz w:val="28"/>
@@ -374,12 +441,12 @@
       </w:tr>
       <w:tr>
         <w:trPr>
-          <w:cantSplit/>
-          <w:trHeight w:val="422"/>
+          <w:trHeight w:val="422" w:hRule="atLeast"/>
+          <w:cantSplit w:val="true"/>
         </w:trPr>
         <w:tc>
           <w:tcPr>
-            <w:tcW w:w="10330" w:type="dxa"/>
+            <w:tcW w:w="10329" w:type="dxa"/>
             <w:gridSpan w:val="2"/>
             <w:tcBorders>
               <w:top w:val="single" w:sz="4" w:space="0" w:color="000000"/>
@@ -387,15 +454,16 @@
               <w:bottom w:val="single" w:sz="4" w:space="0" w:color="000000"/>
               <w:right w:val="single" w:sz="4" w:space="0" w:color="000000"/>
             </w:tcBorders>
-            <w:shd w:val="clear" w:color="auto" w:fill="auto"/>
-          </w:tcPr>
-          <w:p>
-            <w:pPr>
-              <w:pStyle w:val="Ttulo2"/>
+            <w:shd w:color="auto" w:fill="auto" w:val="clear"/>
+          </w:tcPr>
+          <w:p>
+            <w:pPr>
+              <w:pStyle w:val="Heading2"/>
               <w:numPr>
                 <w:ilvl w:val="1"/>
                 <w:numId w:val="1"/>
               </w:numPr>
+              <w:rPr/>
             </w:pPr>
             <w:r>
               <w:rPr>
@@ -408,11 +476,11 @@
       </w:tr>
       <w:tr>
         <w:trPr>
-          <w:trHeight w:val="1615"/>
+          <w:trHeight w:val="1615" w:hRule="atLeast"/>
         </w:trPr>
         <w:tc>
           <w:tcPr>
-            <w:tcW w:w="10330" w:type="dxa"/>
+            <w:tcW w:w="10329" w:type="dxa"/>
             <w:gridSpan w:val="2"/>
             <w:tcBorders>
               <w:top w:val="single" w:sz="4" w:space="0" w:color="000000"/>
@@ -420,21 +488,22 @@
               <w:bottom w:val="single" w:sz="4" w:space="0" w:color="000000"/>
               <w:right w:val="single" w:sz="4" w:space="0" w:color="000000"/>
             </w:tcBorders>
-            <w:shd w:val="clear" w:color="auto" w:fill="auto"/>
-          </w:tcPr>
-          <w:p>
-            <w:pPr>
-              <w:rPr>
-                <w:sz w:val="28"/>
-                <w:szCs w:val="28"/>
-              </w:rPr>
-            </w:pPr>
-            <w:r>
-              <w:rPr>
-                <w:sz w:val="28"/>
-                <w:szCs w:val="28"/>
-              </w:rPr>
-              <w:t>1. Sistema exibe tela com status do pedido e informações sobre o mesmo.(</w:t>
+            <w:shd w:color="auto" w:fill="auto" w:val="clear"/>
+          </w:tcPr>
+          <w:p>
+            <w:pPr>
+              <w:pStyle w:val="Normal"/>
+              <w:rPr>
+                <w:sz w:val="28"/>
+                <w:szCs w:val="28"/>
+              </w:rPr>
+            </w:pPr>
+            <w:r>
+              <w:rPr>
+                <w:sz w:val="28"/>
+                <w:szCs w:val="28"/>
+              </w:rPr>
+              <w:t>1. Ator seleciona a opção “Pedidos” na barra de navegação rápida presente na tela home (</w:t>
             </w:r>
             <w:r>
               <w:rPr>
@@ -442,6 +511,91 @@
                 <w:sz w:val="28"/>
                 <w:szCs w:val="28"/>
               </w:rPr>
+              <w:t>Tela_M01</w:t>
+            </w:r>
+            <w:r>
+              <w:rPr>
+                <w:sz w:val="28"/>
+                <w:szCs w:val="28"/>
+              </w:rPr>
+              <w:t>).</w:t>
+            </w:r>
+          </w:p>
+          <w:p>
+            <w:pPr>
+              <w:pStyle w:val="Normal"/>
+              <w:rPr>
+                <w:sz w:val="28"/>
+                <w:szCs w:val="28"/>
+              </w:rPr>
+            </w:pPr>
+            <w:r>
+              <w:rPr>
+                <w:sz w:val="28"/>
+                <w:szCs w:val="28"/>
+              </w:rPr>
+              <w:t>2. Sistema exibe a tela pedidos (</w:t>
+            </w:r>
+            <w:r>
+              <w:rPr>
+                <w:color w:val="FF4000"/>
+                <w:sz w:val="28"/>
+                <w:szCs w:val="28"/>
+              </w:rPr>
+              <w:t>Tela_M06</w:t>
+            </w:r>
+            <w:r>
+              <w:rPr>
+                <w:sz w:val="28"/>
+                <w:szCs w:val="28"/>
+              </w:rPr>
+              <w:t>).</w:t>
+            </w:r>
+          </w:p>
+          <w:p>
+            <w:pPr>
+              <w:pStyle w:val="Normal"/>
+              <w:rPr>
+                <w:sz w:val="28"/>
+                <w:szCs w:val="28"/>
+              </w:rPr>
+            </w:pPr>
+            <w:r>
+              <w:rPr>
+                <w:sz w:val="28"/>
+                <w:szCs w:val="28"/>
+              </w:rPr>
+              <w:t>3. Ator seleciona a opção “Status do Pedido” para acompanhar o pedido em andamento desejado</w:t>
+            </w:r>
+          </w:p>
+          <w:p>
+            <w:pPr>
+              <w:pStyle w:val="Normal"/>
+              <w:rPr>
+                <w:sz w:val="28"/>
+                <w:szCs w:val="28"/>
+              </w:rPr>
+            </w:pPr>
+            <w:r>
+              <w:rPr>
+                <w:sz w:val="28"/>
+                <w:szCs w:val="28"/>
+              </w:rPr>
+              <w:t>4</w:t>
+            </w:r>
+            <w:r>
+              <w:rPr>
+                <w:sz w:val="28"/>
+                <w:szCs w:val="28"/>
+              </w:rPr>
+              <w:t>. Sistema exibe tela com status do pedido e informações sobre o mesmo.(</w:t>
+            </w:r>
+            <w:r>
+              <w:rPr>
+                <w:color w:val="FF0000"/>
+                <w:sz w:val="28"/>
+                <w:szCs w:val="28"/>
+              </w:rPr>
               <w:t>Tela_M16</w:t>
             </w:r>
             <w:r>
@@ -454,6 +608,7 @@
           </w:p>
           <w:p>
             <w:pPr>
+              <w:pStyle w:val="Normal"/>
               <w:ind w:left="-57" w:right="57"/>
               <w:rPr>
                 <w:sz w:val="28"/>
@@ -465,72 +620,96 @@
                 <w:sz w:val="28"/>
                 <w:szCs w:val="28"/>
               </w:rPr>
-              <w:t>2. Ator seleciona uma das opções disponibilizadas pelo sistema.</w:t>
-            </w:r>
-          </w:p>
-          <w:p>
-            <w:pPr>
-              <w:ind w:left="-170" w:right="57"/>
+              <w:t xml:space="preserve"> </w:t>
+            </w:r>
+            <w:r>
+              <w:rPr>
+                <w:sz w:val="28"/>
+                <w:szCs w:val="28"/>
+              </w:rPr>
+              <w:t>5</w:t>
+            </w:r>
+            <w:r>
+              <w:rPr>
+                <w:sz w:val="28"/>
+                <w:szCs w:val="28"/>
+              </w:rPr>
+              <w:t>. Ator seleciona uma das opções disponibilizadas pelo sistema:</w:t>
+            </w:r>
+          </w:p>
+          <w:p>
+            <w:pPr>
+              <w:pStyle w:val="Normal"/>
+              <w:ind w:left="360"/>
+              <w:rPr>
+                <w:sz w:val="28"/>
+                <w:szCs w:val="28"/>
+              </w:rPr>
+            </w:pPr>
+            <w:r>
               <w:rPr>
                 <w:color w:val="000000"/>
                 <w:sz w:val="28"/>
                 <w:szCs w:val="28"/>
               </w:rPr>
-            </w:pPr>
-            <w:r>
-              <w:rPr>
-                <w:sz w:val="28"/>
-                <w:szCs w:val="28"/>
-              </w:rPr>
-              <w:t>4. Caso a opção seja:</w:t>
-            </w:r>
-          </w:p>
-          <w:p>
-            <w:pPr>
+              <w:t xml:space="preserve">a) </w:t>
+            </w:r>
+            <w:r>
+              <w:rPr>
+                <w:sz w:val="28"/>
+                <w:szCs w:val="28"/>
+              </w:rPr>
+              <w:t>Chat com Estabelecimento</w:t>
+            </w:r>
+            <w:r>
+              <w:rPr>
+                <w:color w:val="000000"/>
+                <w:sz w:val="28"/>
+                <w:szCs w:val="28"/>
+              </w:rPr>
+              <w:t>:</w:t>
+            </w:r>
+            <w:r>
+              <w:rPr>
+                <w:color w:val="FF0000"/>
+                <w:sz w:val="28"/>
+                <w:szCs w:val="28"/>
+              </w:rPr>
+              <w:t xml:space="preserve"> </w:t>
+            </w:r>
+            <w:r>
+              <w:rPr>
+                <w:color w:val="000000"/>
+                <w:sz w:val="28"/>
+                <w:szCs w:val="28"/>
+              </w:rPr>
+              <w:t>Ver</w:t>
+            </w:r>
+            <w:r>
+              <w:rPr>
+                <w:color w:val="FF0000"/>
+                <w:sz w:val="28"/>
+                <w:szCs w:val="28"/>
+              </w:rPr>
+              <w:t xml:space="preserve"> Seção Contatar Restaurante</w:t>
+            </w:r>
+          </w:p>
+          <w:p>
+            <w:pPr>
+              <w:pStyle w:val="Normal"/>
               <w:ind w:left="360"/>
               <w:rPr>
-                <w:sz w:val="28"/>
-                <w:szCs w:val="28"/>
-              </w:rPr>
-            </w:pPr>
-            <w:r>
-              <w:rPr>
-                <w:color w:val="000000"/>
-                <w:sz w:val="28"/>
-                <w:szCs w:val="28"/>
-              </w:rPr>
-              <w:t xml:space="preserve">a) </w:t>
-            </w:r>
-            <w:r>
-              <w:rPr>
-                <w:sz w:val="28"/>
-                <w:szCs w:val="28"/>
-              </w:rPr>
-              <w:t>Chat com Estabelecimento</w:t>
-            </w:r>
-            <w:r>
-              <w:rPr>
-                <w:color w:val="000000"/>
-                <w:sz w:val="28"/>
-                <w:szCs w:val="28"/>
-              </w:rPr>
-              <w:t>:</w:t>
-            </w:r>
-            <w:r>
-              <w:rPr>
                 <w:color w:val="FF0000"/>
                 <w:sz w:val="28"/>
                 <w:szCs w:val="28"/>
               </w:rPr>
-              <w:t xml:space="preserve"> </w:t>
-            </w:r>
-            <w:r>
-              <w:rPr>
-                <w:color w:val="000000"/>
-                <w:sz w:val="28"/>
-                <w:szCs w:val="28"/>
-              </w:rPr>
-              <w:t>Ver</w:t>
+            </w:pPr>
+            <w:r>
+              <w:rPr>
+                <w:sz w:val="28"/>
+                <w:szCs w:val="28"/>
+              </w:rPr>
+              <w:t xml:space="preserve">b) Recebi o pedido: Ver </w:t>
             </w:r>
             <w:r>
               <w:rPr>
@@ -538,36 +717,12 @@
                 <w:sz w:val="28"/>
                 <w:szCs w:val="28"/>
               </w:rPr>
-              <w:t xml:space="preserve"> Seção Contatar Restaurante</w:t>
-            </w:r>
-          </w:p>
-          <w:p>
-            <w:pPr>
-              <w:ind w:left="360"/>
-              <w:rPr>
-                <w:color w:val="FF0000"/>
-                <w:sz w:val="28"/>
-                <w:szCs w:val="28"/>
-              </w:rPr>
-            </w:pPr>
-            <w:r>
-              <w:rPr>
-                <w:sz w:val="28"/>
-                <w:szCs w:val="28"/>
-              </w:rPr>
-              <w:t xml:space="preserve">b) Recebi o pedido: Ver </w:t>
-            </w:r>
-            <w:r>
-              <w:rPr>
-                <w:color w:val="FF0000"/>
-                <w:sz w:val="28"/>
-                <w:szCs w:val="28"/>
-              </w:rPr>
               <w:t>Seção Recebimento do pedido</w:t>
             </w:r>
           </w:p>
           <w:p>
             <w:pPr>
+              <w:pStyle w:val="Normal"/>
               <w:ind w:left="360"/>
               <w:rPr>
                 <w:color w:val="FF0000"/>
@@ -595,11 +750,11 @@
       </w:tr>
       <w:tr>
         <w:trPr>
-          <w:trHeight w:val="420"/>
+          <w:trHeight w:val="420" w:hRule="atLeast"/>
         </w:trPr>
         <w:tc>
           <w:tcPr>
-            <w:tcW w:w="10330" w:type="dxa"/>
+            <w:tcW w:w="10329" w:type="dxa"/>
             <w:gridSpan w:val="2"/>
             <w:tcBorders>
               <w:top w:val="single" w:sz="4" w:space="0" w:color="000000"/>
@@ -607,12 +762,14 @@
               <w:bottom w:val="single" w:sz="4" w:space="0" w:color="000000"/>
               <w:right w:val="single" w:sz="4" w:space="0" w:color="000000"/>
             </w:tcBorders>
-            <w:shd w:val="clear" w:color="auto" w:fill="auto"/>
-          </w:tcPr>
-          <w:p>
-            <w:pPr>
+            <w:shd w:color="auto" w:fill="auto" w:val="clear"/>
+          </w:tcPr>
+          <w:p>
+            <w:pPr>
+              <w:pStyle w:val="Normal"/>
               <w:tabs>
-                <w:tab w:val="left" w:pos="360"/>
+                <w:tab w:val="clear" w:pos="720"/>
+                <w:tab w:val="left" w:pos="360" w:leader="none"/>
               </w:tabs>
               <w:ind w:left="360"/>
               <w:jc w:val="center"/>
@@ -635,11 +792,11 @@
       </w:tr>
       <w:tr>
         <w:trPr>
-          <w:trHeight w:val="525"/>
+          <w:trHeight w:val="525" w:hRule="atLeast"/>
         </w:trPr>
         <w:tc>
           <w:tcPr>
-            <w:tcW w:w="10330" w:type="dxa"/>
+            <w:tcW w:w="10329" w:type="dxa"/>
             <w:gridSpan w:val="2"/>
             <w:tcBorders>
               <w:top w:val="single" w:sz="4" w:space="0" w:color="000000"/>
@@ -647,12 +804,14 @@
               <w:bottom w:val="single" w:sz="4" w:space="0" w:color="000000"/>
               <w:right w:val="single" w:sz="4" w:space="0" w:color="000000"/>
             </w:tcBorders>
-            <w:shd w:val="clear" w:color="auto" w:fill="auto"/>
-          </w:tcPr>
-          <w:p>
-            <w:pPr>
+            <w:shd w:color="auto" w:fill="auto" w:val="clear"/>
+          </w:tcPr>
+          <w:p>
+            <w:pPr>
+              <w:pStyle w:val="Normal"/>
               <w:tabs>
-                <w:tab w:val="left" w:pos="360"/>
+                <w:tab w:val="clear" w:pos="720"/>
+                <w:tab w:val="left" w:pos="360" w:leader="none"/>
               </w:tabs>
               <w:rPr>
                 <w:b/>
@@ -666,14 +825,36 @@
                 <w:sz w:val="28"/>
                 <w:szCs w:val="28"/>
               </w:rPr>
-              <w:t>Linha 2</w:t>
-            </w:r>
-            <w:r>
-              <w:rPr>
-                <w:sz w:val="28"/>
-                <w:szCs w:val="28"/>
-              </w:rPr>
-              <w:t>: Ator seleciona o ícone “Voltar”. Retorna a tela inicial do sistema(</w:t>
+              <w:t xml:space="preserve">Linha </w:t>
+            </w:r>
+            <w:r>
+              <w:rPr>
+                <w:b/>
+                <w:sz w:val="28"/>
+                <w:szCs w:val="28"/>
+              </w:rPr>
+              <w:t>3</w:t>
+            </w:r>
+            <w:r>
+              <w:rPr>
+                <w:sz w:val="28"/>
+                <w:szCs w:val="28"/>
+              </w:rPr>
+              <w:t xml:space="preserve">: Ator seleciona o ícone “Voltar”. Retorna a tela </w:t>
+            </w:r>
+            <w:r>
+              <w:rPr>
+                <w:sz w:val="28"/>
+                <w:szCs w:val="28"/>
+              </w:rPr>
+              <w:t xml:space="preserve">home </w:t>
+            </w:r>
+            <w:r>
+              <w:rPr>
+                <w:sz w:val="28"/>
+                <w:szCs w:val="28"/>
+              </w:rPr>
+              <w:t>(</w:t>
             </w:r>
             <w:r>
               <w:rPr>
@@ -681,7 +862,23 @@
                 <w:sz w:val="28"/>
                 <w:szCs w:val="28"/>
               </w:rPr>
-              <w:t>Tela_M1</w:t>
+              <w:t>Tela_M</w:t>
+            </w:r>
+            <w:r>
+              <w:rPr>
+                <w:color w:val="FF0000"/>
+                <w:sz w:val="28"/>
+                <w:szCs w:val="28"/>
+              </w:rPr>
+              <w:t>0</w:t>
+            </w:r>
+            <w:r>
+              <w:rPr>
+                <w:color w:val="FF0000"/>
+                <w:sz w:val="28"/>
+                <w:szCs w:val="28"/>
+              </w:rPr>
+              <w:t>1</w:t>
             </w:r>
             <w:r>
               <w:rPr>
@@ -689,6 +886,251 @@
                 <w:szCs w:val="28"/>
               </w:rPr>
               <w:t>).</w:t>
+            </w:r>
+          </w:p>
+          <w:p>
+            <w:pPr>
+              <w:pStyle w:val="Normal"/>
+              <w:tabs>
+                <w:tab w:val="clear" w:pos="720"/>
+                <w:tab w:val="left" w:pos="360" w:leader="none"/>
+              </w:tabs>
+              <w:rPr>
+                <w:b/>
+                <w:sz w:val="28"/>
+                <w:szCs w:val="28"/>
+              </w:rPr>
+            </w:pPr>
+            <w:r>
+              <w:rPr>
+                <w:b/>
+                <w:sz w:val="28"/>
+                <w:szCs w:val="28"/>
+              </w:rPr>
+              <w:t xml:space="preserve">Linha </w:t>
+            </w:r>
+            <w:r>
+              <w:rPr>
+                <w:b/>
+                <w:sz w:val="28"/>
+                <w:szCs w:val="28"/>
+              </w:rPr>
+              <w:t>4</w:t>
+            </w:r>
+            <w:r>
+              <w:rPr>
+                <w:sz w:val="28"/>
+                <w:szCs w:val="28"/>
+              </w:rPr>
+              <w:t xml:space="preserve">: Ator seleciona o ícone “Voltar”. Retorna a tela </w:t>
+            </w:r>
+            <w:r>
+              <w:rPr>
+                <w:sz w:val="28"/>
+                <w:szCs w:val="28"/>
+              </w:rPr>
+              <w:t xml:space="preserve">de pedidos </w:t>
+            </w:r>
+            <w:r>
+              <w:rPr>
+                <w:sz w:val="28"/>
+                <w:szCs w:val="28"/>
+              </w:rPr>
+              <w:t>(</w:t>
+            </w:r>
+            <w:r>
+              <w:rPr>
+                <w:color w:val="FF0000"/>
+                <w:sz w:val="28"/>
+                <w:szCs w:val="28"/>
+              </w:rPr>
+              <w:t>Tela_M</w:t>
+            </w:r>
+            <w:r>
+              <w:rPr>
+                <w:color w:val="FF0000"/>
+                <w:sz w:val="28"/>
+                <w:szCs w:val="28"/>
+              </w:rPr>
+              <w:t>0</w:t>
+            </w:r>
+            <w:r>
+              <w:rPr>
+                <w:color w:val="FF0000"/>
+                <w:sz w:val="28"/>
+                <w:szCs w:val="28"/>
+              </w:rPr>
+              <w:t>6</w:t>
+            </w:r>
+            <w:r>
+              <w:rPr>
+                <w:sz w:val="28"/>
+                <w:szCs w:val="28"/>
+              </w:rPr>
+              <w:t>).</w:t>
+            </w:r>
+          </w:p>
+        </w:tc>
+      </w:tr>
+      <w:tr>
+        <w:trPr>
+          <w:trHeight w:val="497" w:hRule="atLeast"/>
+        </w:trPr>
+        <w:tc>
+          <w:tcPr>
+            <w:tcW w:w="10329" w:type="dxa"/>
+            <w:gridSpan w:val="2"/>
+            <w:tcBorders>
+              <w:left w:val="single" w:sz="4" w:space="0" w:color="000000"/>
+              <w:bottom w:val="single" w:sz="4" w:space="0" w:color="000000"/>
+              <w:right w:val="single" w:sz="4" w:space="0" w:color="000000"/>
+            </w:tcBorders>
+            <w:shd w:color="auto" w:fill="auto" w:val="clear"/>
+          </w:tcPr>
+          <w:p>
+            <w:pPr>
+              <w:pStyle w:val="Normal"/>
+              <w:tabs>
+                <w:tab w:val="clear" w:pos="720"/>
+                <w:tab w:val="left" w:pos="360" w:leader="none"/>
+              </w:tabs>
+              <w:jc w:val="center"/>
+              <w:rPr>
+                <w:b/>
+                <w:sz w:val="28"/>
+                <w:szCs w:val="28"/>
+              </w:rPr>
+            </w:pPr>
+            <w:r>
+              <w:rPr>
+                <w:b/>
+                <w:sz w:val="28"/>
+                <w:szCs w:val="28"/>
+              </w:rPr>
+              <w:t>Fluxo Exceção</w:t>
+            </w:r>
+          </w:p>
+        </w:tc>
+      </w:tr>
+      <w:tr>
+        <w:trPr>
+          <w:trHeight w:val="525" w:hRule="atLeast"/>
+        </w:trPr>
+        <w:tc>
+          <w:tcPr>
+            <w:tcW w:w="10329" w:type="dxa"/>
+            <w:gridSpan w:val="2"/>
+            <w:tcBorders>
+              <w:left w:val="single" w:sz="4" w:space="0" w:color="000000"/>
+              <w:bottom w:val="single" w:sz="4" w:space="0" w:color="000000"/>
+              <w:right w:val="single" w:sz="4" w:space="0" w:color="000000"/>
+            </w:tcBorders>
+            <w:shd w:color="auto" w:fill="auto" w:val="clear"/>
+          </w:tcPr>
+          <w:p>
+            <w:pPr>
+              <w:pStyle w:val="Normal"/>
+              <w:tabs>
+                <w:tab w:val="clear" w:pos="720"/>
+                <w:tab w:val="left" w:pos="360" w:leader="none"/>
+              </w:tabs>
+              <w:rPr>
+                <w:b/>
+                <w:sz w:val="28"/>
+                <w:szCs w:val="28"/>
+              </w:rPr>
+            </w:pPr>
+            <w:r>
+              <w:rPr>
+                <w:b/>
+                <w:sz w:val="28"/>
+                <w:szCs w:val="28"/>
+              </w:rPr>
+              <w:t xml:space="preserve">Linha 2: </w:t>
+            </w:r>
+            <w:r>
+              <w:rPr>
+                <w:b w:val="false"/>
+                <w:sz w:val="28"/>
+                <w:szCs w:val="28"/>
+              </w:rPr>
+              <w:t xml:space="preserve">Sistema não </w:t>
+            </w:r>
+            <w:r>
+              <w:rPr>
+                <w:sz w:val="28"/>
+                <w:szCs w:val="28"/>
+              </w:rPr>
+              <w:t>consegue</w:t>
+            </w:r>
+            <w:r>
+              <w:rPr>
+                <w:b w:val="false"/>
+                <w:sz w:val="28"/>
+                <w:szCs w:val="28"/>
+              </w:rPr>
+              <w:t xml:space="preserve"> carregar os dados do</w:t>
+            </w:r>
+            <w:r>
+              <w:rPr>
+                <w:b w:val="false"/>
+                <w:sz w:val="28"/>
+                <w:szCs w:val="28"/>
+              </w:rPr>
+              <w:t>s pedidos</w:t>
+            </w:r>
+            <w:r>
+              <w:rPr>
+                <w:b w:val="false"/>
+                <w:sz w:val="28"/>
+                <w:szCs w:val="28"/>
+              </w:rPr>
+              <w:t>. Sistema exibe mensagem:</w:t>
+            </w:r>
+          </w:p>
+          <w:p>
+            <w:pPr>
+              <w:pStyle w:val="BodyText"/>
+              <w:tabs>
+                <w:tab w:val="clear" w:pos="720"/>
+                <w:tab w:val="left" w:pos="360" w:leader="none"/>
+              </w:tabs>
+              <w:spacing w:before="0" w:after="140"/>
+              <w:jc w:val="left"/>
+              <w:rPr/>
+            </w:pPr>
+            <w:r>
+              <w:rPr>
+                <w:b w:val="false"/>
+                <w:sz w:val="28"/>
+                <w:szCs w:val="28"/>
+              </w:rPr>
+              <w:t>“</w:t>
+            </w:r>
+            <w:r>
+              <w:rPr>
+                <w:b w:val="false"/>
+                <w:sz w:val="28"/>
+                <w:szCs w:val="28"/>
+              </w:rPr>
+              <w:t>Erro ao tentar solicitar dados. Tente novamente” e mantém a tela home (</w:t>
+            </w:r>
+            <w:r>
+              <w:rPr>
+                <w:b w:val="false"/>
+                <w:color w:val="FF0000"/>
+                <w:sz w:val="28"/>
+                <w:szCs w:val="28"/>
+              </w:rPr>
+              <w:t>Tela_M01</w:t>
+            </w:r>
+            <w:r>
+              <w:rPr>
+                <w:b w:val="false"/>
+                <w:sz w:val="28"/>
+                <w:szCs w:val="28"/>
+              </w:rPr>
+              <w:t>) atual.</w:t>
             </w:r>
           </w:p>
         </w:tc>
@@ -696,33 +1138,50 @@
     </w:tbl>
     <w:p>
       <w:pPr>
+        <w:pStyle w:val="Normal"/>
         <w:jc w:val="center"/>
+        <w:rPr/>
       </w:pPr>
+      <w:r>
+        <w:rPr/>
+      </w:r>
     </w:p>
     <w:p>
       <w:pPr>
+        <w:pStyle w:val="Normal"/>
         <w:jc w:val="center"/>
+        <w:rPr/>
       </w:pPr>
+      <w:r>
+        <w:rPr/>
+      </w:r>
     </w:p>
     <w:p>
       <w:pPr>
+        <w:pStyle w:val="Normal"/>
         <w:jc w:val="center"/>
+        <w:rPr/>
       </w:pPr>
+      <w:r>
+        <w:rPr/>
+      </w:r>
     </w:p>
     <w:p>
       <w:pPr>
-        <w:pStyle w:val="Ttulo1"/>
+        <w:pStyle w:val="Heading1"/>
         <w:numPr>
           <w:ilvl w:val="0"/>
           <w:numId w:val="1"/>
         </w:numPr>
+        <w:rPr/>
       </w:pPr>
       <w:r>
+        <w:rPr/>
         <w:t xml:space="preserve">Seção: </w:t>
       </w:r>
       <w:r>
         <w:rPr>
-          <w:b w:val="0"/>
+          <w:b w:val="false"/>
         </w:rPr>
         <w:t>Contatar Restaurante</w:t>
       </w:r>
@@ -731,27 +1190,39 @@
       <w:tblPr>
         <w:tblStyle w:val="a0"/>
         <w:tblW w:w="10330" w:type="dxa"/>
+        <w:jc w:val="left"/>
         <w:tblInd w:w="-70" w:type="dxa"/>
         <w:tblLayout w:type="fixed"/>
-        <w:tblLook w:val="0000" w:firstRow="0" w:lastRow="0" w:firstColumn="0" w:lastColumn="0" w:noHBand="0" w:noVBand="0"/>
+        <w:tblCellMar>
+          <w:top w:w="0" w:type="dxa"/>
+          <w:left w:w="108" w:type="dxa"/>
+          <w:bottom w:w="0" w:type="dxa"/>
+          <w:right w:w="108" w:type="dxa"/>
+        </w:tblCellMar>
+        <w:tblLook w:val="0000" w:noHBand="0" w:noVBand="0" w:firstColumn="0" w:lastRow="0" w:lastColumn="0" w:firstRow="0"/>
       </w:tblPr>
       <w:tblGrid>
-        <w:gridCol w:w="2905"/>
+        <w:gridCol w:w="2904"/>
         <w:gridCol w:w="7425"/>
       </w:tblGrid>
       <w:tr>
-        <w:tc>
-          <w:tcPr>
-            <w:tcW w:w="2905" w:type="dxa"/>
-            <w:tcBorders>
-              <w:top w:val="single" w:sz="4" w:space="0" w:color="000000"/>
-              <w:left w:val="single" w:sz="4" w:space="0" w:color="000000"/>
-              <w:bottom w:val="single" w:sz="4" w:space="0" w:color="000000"/>
-              <w:right w:val="single" w:sz="4" w:space="0" w:color="000000"/>
-            </w:tcBorders>
-            <w:shd w:val="clear" w:color="auto" w:fill="auto"/>
-          </w:tcPr>
-          <w:p>
+        <w:trPr/>
+        <w:tc>
+          <w:tcPr>
+            <w:tcW w:w="2904" w:type="dxa"/>
+            <w:tcBorders>
+              <w:top w:val="single" w:sz="4" w:space="0" w:color="000000"/>
+              <w:left w:val="single" w:sz="4" w:space="0" w:color="000000"/>
+              <w:bottom w:val="single" w:sz="4" w:space="0" w:color="000000"/>
+              <w:right w:val="single" w:sz="4" w:space="0" w:color="000000"/>
+            </w:tcBorders>
+            <w:shd w:color="auto" w:fill="auto" w:val="clear"/>
+          </w:tcPr>
+          <w:p>
+            <w:pPr>
+              <w:pStyle w:val="Normal"/>
+              <w:rPr/>
+            </w:pPr>
             <w:r>
               <w:rPr>
                 <w:b/>
@@ -771,9 +1242,13 @@
               <w:bottom w:val="single" w:sz="4" w:space="0" w:color="000000"/>
               <w:right w:val="single" w:sz="4" w:space="0" w:color="000000"/>
             </w:tcBorders>
-            <w:shd w:val="clear" w:color="auto" w:fill="auto"/>
-          </w:tcPr>
-          <w:p>
+            <w:shd w:color="auto" w:fill="auto" w:val="clear"/>
+          </w:tcPr>
+          <w:p>
+            <w:pPr>
+              <w:pStyle w:val="Normal"/>
+              <w:rPr/>
+            </w:pPr>
             <w:r>
               <w:rPr>
                 <w:sz w:val="28"/>
@@ -786,11 +1261,11 @@
       </w:tr>
       <w:tr>
         <w:trPr>
-          <w:cantSplit/>
+          <w:cantSplit w:val="true"/>
         </w:trPr>
         <w:tc>
           <w:tcPr>
-            <w:tcW w:w="10330" w:type="dxa"/>
+            <w:tcW w:w="10329" w:type="dxa"/>
             <w:gridSpan w:val="2"/>
             <w:tcBorders>
               <w:top w:val="single" w:sz="4" w:space="0" w:color="000000"/>
@@ -798,15 +1273,16 @@
               <w:bottom w:val="single" w:sz="4" w:space="0" w:color="000000"/>
               <w:right w:val="single" w:sz="4" w:space="0" w:color="000000"/>
             </w:tcBorders>
-            <w:shd w:val="clear" w:color="auto" w:fill="auto"/>
-          </w:tcPr>
-          <w:p>
-            <w:pPr>
-              <w:pStyle w:val="Ttulo2"/>
+            <w:shd w:color="auto" w:fill="auto" w:val="clear"/>
+          </w:tcPr>
+          <w:p>
+            <w:pPr>
+              <w:pStyle w:val="Heading2"/>
               <w:numPr>
                 <w:ilvl w:val="1"/>
                 <w:numId w:val="1"/>
               </w:numPr>
+              <w:rPr/>
             </w:pPr>
             <w:r>
               <w:rPr>
@@ -819,11 +1295,11 @@
       </w:tr>
       <w:tr>
         <w:trPr>
-          <w:trHeight w:val="810"/>
+          <w:trHeight w:val="810" w:hRule="atLeast"/>
         </w:trPr>
         <w:tc>
           <w:tcPr>
-            <w:tcW w:w="10330" w:type="dxa"/>
+            <w:tcW w:w="10329" w:type="dxa"/>
             <w:gridSpan w:val="2"/>
             <w:tcBorders>
               <w:top w:val="single" w:sz="4" w:space="0" w:color="000000"/>
@@ -831,52 +1307,70 @@
               <w:bottom w:val="single" w:sz="4" w:space="0" w:color="000000"/>
               <w:right w:val="single" w:sz="4" w:space="0" w:color="000000"/>
             </w:tcBorders>
-            <w:shd w:val="clear" w:color="auto" w:fill="auto"/>
-          </w:tcPr>
-          <w:p>
-            <w:pPr>
+            <w:shd w:color="auto" w:fill="auto" w:val="clear"/>
+          </w:tcPr>
+          <w:p>
+            <w:pPr>
+              <w:pStyle w:val="Normal"/>
               <w:numPr>
                 <w:ilvl w:val="0"/>
                 <w:numId w:val="2"/>
               </w:numPr>
               <w:tabs>
-                <w:tab w:val="left" w:pos="360"/>
+                <w:tab w:val="clear" w:pos="720"/>
+                <w:tab w:val="left" w:pos="360" w:leader="none"/>
               </w:tabs>
-              <w:ind w:left="360"/>
-              <w:rPr>
-                <w:sz w:val="28"/>
-                <w:szCs w:val="28"/>
-              </w:rPr>
-            </w:pPr>
-            <w:r>
-              <w:rPr>
-                <w:sz w:val="28"/>
-                <w:szCs w:val="28"/>
-              </w:rPr>
-              <w:t>Ator seleciona opção de “Contatar Restaurante”.</w:t>
-            </w:r>
-          </w:p>
-          <w:p>
-            <w:pPr>
+              <w:ind w:hanging="360" w:left="360"/>
+              <w:rPr>
+                <w:sz w:val="28"/>
+                <w:szCs w:val="28"/>
+              </w:rPr>
+            </w:pPr>
+            <w:r>
+              <w:rPr>
+                <w:sz w:val="28"/>
+                <w:szCs w:val="28"/>
+              </w:rPr>
+              <w:t>Ator seleciona opção de “C</w:t>
+            </w:r>
+            <w:r>
+              <w:rPr>
+                <w:sz w:val="28"/>
+                <w:szCs w:val="28"/>
+              </w:rPr>
+              <w:t>hat com Estabelecimento</w:t>
+            </w:r>
+            <w:r>
+              <w:rPr>
+                <w:sz w:val="28"/>
+                <w:szCs w:val="28"/>
+              </w:rPr>
+              <w:t>”.</w:t>
+            </w:r>
+          </w:p>
+          <w:p>
+            <w:pPr>
+              <w:pStyle w:val="Normal"/>
               <w:numPr>
                 <w:ilvl w:val="0"/>
                 <w:numId w:val="2"/>
               </w:numPr>
               <w:tabs>
-                <w:tab w:val="left" w:pos="360"/>
+                <w:tab w:val="clear" w:pos="720"/>
+                <w:tab w:val="left" w:pos="360" w:leader="none"/>
               </w:tabs>
-              <w:ind w:left="360"/>
-              <w:rPr>
-                <w:sz w:val="28"/>
-                <w:szCs w:val="28"/>
-              </w:rPr>
-            </w:pPr>
-            <w:r>
-              <w:rPr>
-                <w:sz w:val="28"/>
-                <w:szCs w:val="28"/>
-              </w:rPr>
-              <w:t>O sistema exibe chat com o restaurante(</w:t>
+              <w:ind w:hanging="360" w:left="360"/>
+              <w:rPr>
+                <w:sz w:val="28"/>
+                <w:szCs w:val="28"/>
+              </w:rPr>
+            </w:pPr>
+            <w:r>
+              <w:rPr>
+                <w:sz w:val="28"/>
+                <w:szCs w:val="28"/>
+              </w:rPr>
+              <w:t>O sistema exibe chat com o restaurante (</w:t>
             </w:r>
             <w:r>
               <w:rPr>
@@ -896,14 +1390,16 @@
           </w:p>
           <w:p>
             <w:pPr>
+              <w:pStyle w:val="Normal"/>
               <w:numPr>
                 <w:ilvl w:val="0"/>
                 <w:numId w:val="2"/>
               </w:numPr>
               <w:tabs>
-                <w:tab w:val="left" w:pos="360"/>
+                <w:tab w:val="clear" w:pos="720"/>
+                <w:tab w:val="left" w:pos="360" w:leader="none"/>
               </w:tabs>
-              <w:ind w:left="360"/>
+              <w:ind w:hanging="360" w:left="360"/>
               <w:rPr>
                 <w:sz w:val="28"/>
                 <w:szCs w:val="28"/>
@@ -915,33 +1411,9 @@
                 <w:szCs w:val="28"/>
               </w:rPr>
               <w:t>Ator interage com o restaurante</w:t>
-            </w:r>
-            <w:r>
-              <w:rPr>
-                <w:sz w:val="28"/>
-                <w:szCs w:val="28"/>
-              </w:rPr>
               <w:tab/>
-            </w:r>
-            <w:r>
-              <w:rPr>
-                <w:sz w:val="28"/>
-                <w:szCs w:val="28"/>
-              </w:rPr>
               <w:tab/>
-            </w:r>
-            <w:r>
-              <w:rPr>
-                <w:sz w:val="28"/>
-                <w:szCs w:val="28"/>
-              </w:rPr>
               <w:tab/>
-            </w:r>
-            <w:r>
-              <w:rPr>
-                <w:sz w:val="28"/>
-                <w:szCs w:val="28"/>
-              </w:rPr>
               <w:tab/>
             </w:r>
           </w:p>
@@ -949,11 +1421,11 @@
       </w:tr>
       <w:tr>
         <w:trPr>
-          <w:trHeight w:val="480"/>
+          <w:trHeight w:val="480" w:hRule="atLeast"/>
         </w:trPr>
         <w:tc>
           <w:tcPr>
-            <w:tcW w:w="10330" w:type="dxa"/>
+            <w:tcW w:w="10329" w:type="dxa"/>
             <w:gridSpan w:val="2"/>
             <w:tcBorders>
               <w:top w:val="single" w:sz="4" w:space="0" w:color="000000"/>
@@ -961,14 +1433,16 @@
               <w:bottom w:val="single" w:sz="4" w:space="0" w:color="000000"/>
               <w:right w:val="single" w:sz="4" w:space="0" w:color="000000"/>
             </w:tcBorders>
-            <w:shd w:val="clear" w:color="auto" w:fill="auto"/>
-          </w:tcPr>
-          <w:p>
-            <w:pPr>
+            <w:shd w:color="auto" w:fill="auto" w:val="clear"/>
+          </w:tcPr>
+          <w:p>
+            <w:pPr>
+              <w:pStyle w:val="Normal"/>
               <w:tabs>
-                <w:tab w:val="left" w:pos="360"/>
+                <w:tab w:val="clear" w:pos="720"/>
+                <w:tab w:val="left" w:pos="360" w:leader="none"/>
               </w:tabs>
-              <w:ind w:left="360" w:hanging="360"/>
+              <w:ind w:hanging="360" w:left="360"/>
               <w:jc w:val="center"/>
               <w:rPr>
                 <w:b/>
@@ -989,11 +1463,11 @@
       </w:tr>
       <w:tr>
         <w:trPr>
-          <w:trHeight w:val="480"/>
+          <w:trHeight w:val="480" w:hRule="atLeast"/>
         </w:trPr>
         <w:tc>
           <w:tcPr>
-            <w:tcW w:w="10330" w:type="dxa"/>
+            <w:tcW w:w="10329" w:type="dxa"/>
             <w:gridSpan w:val="2"/>
             <w:tcBorders>
               <w:top w:val="single" w:sz="4" w:space="0" w:color="000000"/>
@@ -1001,12 +1475,14 @@
               <w:bottom w:val="single" w:sz="4" w:space="0" w:color="000000"/>
               <w:right w:val="single" w:sz="4" w:space="0" w:color="000000"/>
             </w:tcBorders>
-            <w:shd w:val="clear" w:color="auto" w:fill="auto"/>
-          </w:tcPr>
-          <w:p>
-            <w:pPr>
+            <w:shd w:color="auto" w:fill="auto" w:val="clear"/>
+          </w:tcPr>
+          <w:p>
+            <w:pPr>
+              <w:pStyle w:val="Normal"/>
               <w:tabs>
-                <w:tab w:val="left" w:pos="360"/>
+                <w:tab w:val="clear" w:pos="720"/>
+                <w:tab w:val="left" w:pos="360" w:leader="none"/>
               </w:tabs>
               <w:rPr>
                 <w:b/>
@@ -1027,23 +1503,7 @@
                 <w:sz w:val="28"/>
                 <w:szCs w:val="28"/>
               </w:rPr>
-              <w:t xml:space="preserve">: Ator seleciona o </w:t>
-            </w:r>
-            <w:proofErr w:type="spellStart"/>
-            <w:r>
-              <w:rPr>
-                <w:sz w:val="28"/>
-                <w:szCs w:val="28"/>
-              </w:rPr>
-              <w:t>ícone“Voltar</w:t>
-            </w:r>
-            <w:proofErr w:type="spellEnd"/>
-            <w:r>
-              <w:rPr>
-                <w:sz w:val="28"/>
-                <w:szCs w:val="28"/>
-              </w:rPr>
-              <w:t>”. Retorna a tela status do pedido(</w:t>
+              <w:t>: Ator seleciona o ícone“Voltar”. Retorna a tela status do pedido (</w:t>
             </w:r>
             <w:r>
               <w:rPr>
@@ -1065,11 +1525,11 @@
       </w:tr>
       <w:tr>
         <w:trPr>
-          <w:trHeight w:val="480"/>
+          <w:trHeight w:val="480" w:hRule="atLeast"/>
         </w:trPr>
         <w:tc>
           <w:tcPr>
-            <w:tcW w:w="10330" w:type="dxa"/>
+            <w:tcW w:w="10329" w:type="dxa"/>
             <w:gridSpan w:val="2"/>
             <w:tcBorders>
               <w:top w:val="single" w:sz="4" w:space="0" w:color="000000"/>
@@ -1077,12 +1537,14 @@
               <w:bottom w:val="single" w:sz="4" w:space="0" w:color="000000"/>
               <w:right w:val="single" w:sz="4" w:space="0" w:color="000000"/>
             </w:tcBorders>
-            <w:shd w:val="clear" w:color="auto" w:fill="auto"/>
-          </w:tcPr>
-          <w:p>
-            <w:pPr>
+            <w:shd w:color="auto" w:fill="auto" w:val="clear"/>
+          </w:tcPr>
+          <w:p>
+            <w:pPr>
+              <w:pStyle w:val="Normal"/>
               <w:tabs>
-                <w:tab w:val="left" w:pos="360"/>
+                <w:tab w:val="clear" w:pos="720"/>
+                <w:tab w:val="left" w:pos="360" w:leader="none"/>
               </w:tabs>
               <w:jc w:val="center"/>
               <w:rPr>
@@ -1104,11 +1566,11 @@
       </w:tr>
       <w:tr>
         <w:trPr>
-          <w:trHeight w:val="480"/>
+          <w:trHeight w:val="85" w:hRule="atLeast"/>
         </w:trPr>
         <w:tc>
           <w:tcPr>
-            <w:tcW w:w="10330" w:type="dxa"/>
+            <w:tcW w:w="10329" w:type="dxa"/>
             <w:gridSpan w:val="2"/>
             <w:tcBorders>
               <w:top w:val="single" w:sz="4" w:space="0" w:color="000000"/>
@@ -1116,12 +1578,14 @@
               <w:bottom w:val="single" w:sz="4" w:space="0" w:color="000000"/>
               <w:right w:val="single" w:sz="4" w:space="0" w:color="000000"/>
             </w:tcBorders>
-            <w:shd w:val="clear" w:color="auto" w:fill="auto"/>
-          </w:tcPr>
-          <w:p>
-            <w:pPr>
+            <w:shd w:color="auto" w:fill="auto" w:val="clear"/>
+          </w:tcPr>
+          <w:p>
+            <w:pPr>
+              <w:pStyle w:val="Normal"/>
               <w:tabs>
-                <w:tab w:val="left" w:pos="360"/>
+                <w:tab w:val="clear" w:pos="720"/>
+                <w:tab w:val="left" w:pos="360" w:leader="none"/>
               </w:tabs>
               <w:jc w:val="both"/>
               <w:rPr>
@@ -1144,15 +1608,7 @@
                 <w:sz w:val="28"/>
                 <w:szCs w:val="28"/>
               </w:rPr>
-              <w:t>Não foi possível estabelecer a conexão entre o restaurante e o usuário, exibindo a mensagem: “Chat indisponível!”.</w:t>
-            </w:r>
-            <w:r>
-              <w:rPr>
-                <w:bCs/>
-                <w:sz w:val="28"/>
-                <w:szCs w:val="28"/>
-              </w:rPr>
-              <w:t xml:space="preserve"> Retorna para tela </w:t>
+              <w:t xml:space="preserve">Não foi possível estabelecer a conexão entre o restaurante e o usuário, exibindo a mensagem: “Chat indisponível!”. Retorna para tela </w:t>
             </w:r>
             <w:r>
               <w:rPr>
@@ -1174,39 +1630,47 @@
                 <w:sz w:val="28"/>
                 <w:szCs w:val="28"/>
               </w:rPr>
-              <w:t>)</w:t>
-            </w:r>
-            <w:r>
-              <w:rPr>
-                <w:sz w:val="28"/>
-                <w:szCs w:val="28"/>
-              </w:rPr>
-              <w:t>.</w:t>
+              <w:t>).</w:t>
             </w:r>
           </w:p>
         </w:tc>
       </w:tr>
     </w:tbl>
-    <w:p/>
     <w:p>
       <w:pPr>
-        <w:jc w:val="center"/>
+        <w:pStyle w:val="Normal"/>
+        <w:rPr/>
       </w:pPr>
+      <w:r>
+        <w:rPr/>
+      </w:r>
     </w:p>
     <w:p>
       <w:pPr>
-        <w:pStyle w:val="Ttulo1"/>
+        <w:pStyle w:val="Normal"/>
+        <w:jc w:val="center"/>
+        <w:rPr/>
+      </w:pPr>
+      <w:r>
+        <w:rPr/>
+      </w:r>
+    </w:p>
+    <w:p>
+      <w:pPr>
+        <w:pStyle w:val="Heading1"/>
         <w:numPr>
           <w:ilvl w:val="0"/>
           <w:numId w:val="1"/>
         </w:numPr>
+        <w:rPr/>
       </w:pPr>
       <w:r>
+        <w:rPr/>
         <w:t xml:space="preserve">Seção: </w:t>
       </w:r>
       <w:r>
         <w:rPr>
-          <w:b w:val="0"/>
+          <w:b w:val="false"/>
         </w:rPr>
         <w:t>Recebimento do pedido</w:t>
       </w:r>
@@ -1215,27 +1679,39 @@
       <w:tblPr>
         <w:tblStyle w:val="a1"/>
         <w:tblW w:w="10330" w:type="dxa"/>
+        <w:jc w:val="left"/>
         <w:tblInd w:w="-70" w:type="dxa"/>
         <w:tblLayout w:type="fixed"/>
-        <w:tblLook w:val="0000" w:firstRow="0" w:lastRow="0" w:firstColumn="0" w:lastColumn="0" w:noHBand="0" w:noVBand="0"/>
+        <w:tblCellMar>
+          <w:top w:w="0" w:type="dxa"/>
+          <w:left w:w="108" w:type="dxa"/>
+          <w:bottom w:w="0" w:type="dxa"/>
+          <w:right w:w="108" w:type="dxa"/>
+        </w:tblCellMar>
+        <w:tblLook w:val="0000" w:noHBand="0" w:noVBand="0" w:firstColumn="0" w:lastRow="0" w:lastColumn="0" w:firstRow="0"/>
       </w:tblPr>
       <w:tblGrid>
-        <w:gridCol w:w="2905"/>
+        <w:gridCol w:w="2904"/>
         <w:gridCol w:w="7425"/>
       </w:tblGrid>
       <w:tr>
-        <w:tc>
-          <w:tcPr>
-            <w:tcW w:w="2905" w:type="dxa"/>
-            <w:tcBorders>
-              <w:top w:val="single" w:sz="4" w:space="0" w:color="000000"/>
-              <w:left w:val="single" w:sz="4" w:space="0" w:color="000000"/>
-              <w:bottom w:val="single" w:sz="4" w:space="0" w:color="000000"/>
-              <w:right w:val="single" w:sz="4" w:space="0" w:color="000000"/>
-            </w:tcBorders>
-            <w:shd w:val="clear" w:color="auto" w:fill="auto"/>
-          </w:tcPr>
-          <w:p>
+        <w:trPr/>
+        <w:tc>
+          <w:tcPr>
+            <w:tcW w:w="2904" w:type="dxa"/>
+            <w:tcBorders>
+              <w:top w:val="single" w:sz="4" w:space="0" w:color="000000"/>
+              <w:left w:val="single" w:sz="4" w:space="0" w:color="000000"/>
+              <w:bottom w:val="single" w:sz="4" w:space="0" w:color="000000"/>
+              <w:right w:val="single" w:sz="4" w:space="0" w:color="000000"/>
+            </w:tcBorders>
+            <w:shd w:color="auto" w:fill="auto" w:val="clear"/>
+          </w:tcPr>
+          <w:p>
+            <w:pPr>
+              <w:pStyle w:val="Normal"/>
+              <w:rPr/>
+            </w:pPr>
             <w:r>
               <w:rPr>
                 <w:b/>
@@ -1255,9 +1731,13 @@
               <w:bottom w:val="single" w:sz="4" w:space="0" w:color="000000"/>
               <w:right w:val="single" w:sz="4" w:space="0" w:color="000000"/>
             </w:tcBorders>
-            <w:shd w:val="clear" w:color="auto" w:fill="auto"/>
-          </w:tcPr>
-          <w:p>
+            <w:shd w:color="auto" w:fill="auto" w:val="clear"/>
+          </w:tcPr>
+          <w:p>
+            <w:pPr>
+              <w:pStyle w:val="Normal"/>
+              <w:rPr/>
+            </w:pPr>
             <w:r>
               <w:rPr>
                 <w:sz w:val="28"/>
@@ -1270,11 +1750,11 @@
       </w:tr>
       <w:tr>
         <w:trPr>
-          <w:cantSplit/>
+          <w:cantSplit w:val="true"/>
         </w:trPr>
         <w:tc>
           <w:tcPr>
-            <w:tcW w:w="10330" w:type="dxa"/>
+            <w:tcW w:w="10329" w:type="dxa"/>
             <w:gridSpan w:val="2"/>
             <w:tcBorders>
               <w:top w:val="single" w:sz="4" w:space="0" w:color="000000"/>
@@ -1282,21 +1762,21 @@
               <w:bottom w:val="single" w:sz="4" w:space="0" w:color="000000"/>
               <w:right w:val="single" w:sz="4" w:space="0" w:color="000000"/>
             </w:tcBorders>
-            <w:shd w:val="clear" w:color="auto" w:fill="auto"/>
-          </w:tcPr>
-          <w:p>
-            <w:pPr>
-              <w:pStyle w:val="Ttulo2"/>
+            <w:shd w:color="auto" w:fill="auto" w:val="clear"/>
+          </w:tcPr>
+          <w:p>
+            <w:pPr>
+              <w:pStyle w:val="Heading2"/>
               <w:numPr>
                 <w:ilvl w:val="1"/>
                 <w:numId w:val="1"/>
               </w:numPr>
-            </w:pPr>
-            <w:r>
-              <w:rPr>
-                <w:b/>
-              </w:rPr>
-              <w:lastRenderedPageBreak/>
+              <w:rPr/>
+            </w:pPr>
+            <w:r>
+              <w:rPr>
+                <w:b/>
+              </w:rPr>
               <w:t>Fluxo Principal</w:t>
             </w:r>
           </w:p>
@@ -1304,11 +1784,11 @@
       </w:tr>
       <w:tr>
         <w:trPr>
-          <w:trHeight w:val="1155"/>
+          <w:trHeight w:val="1155" w:hRule="atLeast"/>
         </w:trPr>
         <w:tc>
           <w:tcPr>
-            <w:tcW w:w="10330" w:type="dxa"/>
+            <w:tcW w:w="10329" w:type="dxa"/>
             <w:gridSpan w:val="2"/>
             <w:tcBorders>
               <w:top w:val="single" w:sz="4" w:space="0" w:color="000000"/>
@@ -1316,12 +1796,14 @@
               <w:bottom w:val="single" w:sz="4" w:space="0" w:color="000000"/>
               <w:right w:val="single" w:sz="4" w:space="0" w:color="000000"/>
             </w:tcBorders>
-            <w:shd w:val="clear" w:color="auto" w:fill="auto"/>
-          </w:tcPr>
-          <w:p>
-            <w:pPr>
+            <w:shd w:color="auto" w:fill="auto" w:val="clear"/>
+          </w:tcPr>
+          <w:p>
+            <w:pPr>
+              <w:pStyle w:val="Normal"/>
               <w:tabs>
-                <w:tab w:val="left" w:pos="360"/>
+                <w:tab w:val="clear" w:pos="720"/>
+                <w:tab w:val="left" w:pos="360" w:leader="none"/>
               </w:tabs>
               <w:rPr>
                 <w:sz w:val="28"/>
@@ -1338,8 +1820,10 @@
           </w:p>
           <w:p>
             <w:pPr>
+              <w:pStyle w:val="Normal"/>
               <w:tabs>
-                <w:tab w:val="left" w:pos="360"/>
+                <w:tab w:val="clear" w:pos="720"/>
+                <w:tab w:val="left" w:pos="360" w:leader="none"/>
               </w:tabs>
               <w:rPr>
                 <w:sz w:val="28"/>
@@ -1371,8 +1855,10 @@
           </w:p>
           <w:p>
             <w:pPr>
+              <w:pStyle w:val="Normal"/>
               <w:tabs>
-                <w:tab w:val="left" w:pos="360"/>
+                <w:tab w:val="clear" w:pos="720"/>
+                <w:tab w:val="left" w:pos="360" w:leader="none"/>
               </w:tabs>
               <w:rPr>
                 <w:sz w:val="28"/>
@@ -1391,11 +1877,11 @@
       </w:tr>
       <w:tr>
         <w:trPr>
-          <w:trHeight w:val="570"/>
+          <w:trHeight w:val="570" w:hRule="atLeast"/>
         </w:trPr>
         <w:tc>
           <w:tcPr>
-            <w:tcW w:w="10330" w:type="dxa"/>
+            <w:tcW w:w="10329" w:type="dxa"/>
             <w:gridSpan w:val="2"/>
             <w:tcBorders>
               <w:top w:val="single" w:sz="4" w:space="0" w:color="000000"/>
@@ -1403,12 +1889,14 @@
               <w:bottom w:val="single" w:sz="4" w:space="0" w:color="000000"/>
               <w:right w:val="single" w:sz="4" w:space="0" w:color="000000"/>
             </w:tcBorders>
-            <w:shd w:val="clear" w:color="auto" w:fill="auto"/>
-          </w:tcPr>
-          <w:p>
-            <w:pPr>
+            <w:shd w:color="auto" w:fill="auto" w:val="clear"/>
+          </w:tcPr>
+          <w:p>
+            <w:pPr>
+              <w:pStyle w:val="Normal"/>
               <w:tabs>
-                <w:tab w:val="left" w:pos="360"/>
+                <w:tab w:val="clear" w:pos="720"/>
+                <w:tab w:val="left" w:pos="360" w:leader="none"/>
               </w:tabs>
               <w:jc w:val="center"/>
               <w:rPr>
@@ -1430,11 +1918,11 @@
       </w:tr>
       <w:tr>
         <w:trPr>
-          <w:trHeight w:val="570"/>
+          <w:trHeight w:val="570" w:hRule="atLeast"/>
         </w:trPr>
         <w:tc>
           <w:tcPr>
-            <w:tcW w:w="10330" w:type="dxa"/>
+            <w:tcW w:w="10329" w:type="dxa"/>
             <w:gridSpan w:val="2"/>
             <w:tcBorders>
               <w:top w:val="single" w:sz="4" w:space="0" w:color="000000"/>
@@ -1442,12 +1930,14 @@
               <w:bottom w:val="single" w:sz="4" w:space="0" w:color="000000"/>
               <w:right w:val="single" w:sz="4" w:space="0" w:color="000000"/>
             </w:tcBorders>
-            <w:shd w:val="clear" w:color="auto" w:fill="auto"/>
-          </w:tcPr>
-          <w:p>
-            <w:pPr>
+            <w:shd w:color="auto" w:fill="auto" w:val="clear"/>
+          </w:tcPr>
+          <w:p>
+            <w:pPr>
+              <w:pStyle w:val="Normal"/>
               <w:tabs>
-                <w:tab w:val="left" w:pos="360"/>
+                <w:tab w:val="clear" w:pos="720"/>
+                <w:tab w:val="left" w:pos="360" w:leader="none"/>
               </w:tabs>
               <w:rPr>
                 <w:b/>
@@ -1468,7 +1958,7 @@
                 <w:sz w:val="28"/>
                 <w:szCs w:val="28"/>
               </w:rPr>
-              <w:t>Ator seleciona o ícone “Voltar”. Retorna a tela inicial do sistema(</w:t>
+              <w:t>Ator seleciona o ícone “Voltar”. Retorna a tela inicial do sistema (</w:t>
             </w:r>
             <w:r>
               <w:rPr>
@@ -1476,7 +1966,23 @@
                 <w:sz w:val="28"/>
                 <w:szCs w:val="28"/>
               </w:rPr>
-              <w:t>Tela_M1</w:t>
+              <w:t>Tela_M</w:t>
+            </w:r>
+            <w:r>
+              <w:rPr>
+                <w:color w:val="FF0000"/>
+                <w:sz w:val="28"/>
+                <w:szCs w:val="28"/>
+              </w:rPr>
+              <w:t>0</w:t>
+            </w:r>
+            <w:r>
+              <w:rPr>
+                <w:color w:val="FF0000"/>
+                <w:sz w:val="28"/>
+                <w:szCs w:val="28"/>
+              </w:rPr>
+              <w:t>1</w:t>
             </w:r>
             <w:r>
               <w:rPr>
@@ -1490,11 +1996,11 @@
       </w:tr>
       <w:tr>
         <w:trPr>
-          <w:trHeight w:val="570"/>
+          <w:trHeight w:val="570" w:hRule="atLeast"/>
         </w:trPr>
         <w:tc>
           <w:tcPr>
-            <w:tcW w:w="10330" w:type="dxa"/>
+            <w:tcW w:w="10329" w:type="dxa"/>
             <w:gridSpan w:val="2"/>
             <w:tcBorders>
               <w:top w:val="single" w:sz="4" w:space="0" w:color="000000"/>
@@ -1502,12 +2008,14 @@
               <w:bottom w:val="single" w:sz="4" w:space="0" w:color="000000"/>
               <w:right w:val="single" w:sz="4" w:space="0" w:color="000000"/>
             </w:tcBorders>
-            <w:shd w:val="clear" w:color="auto" w:fill="auto"/>
-          </w:tcPr>
-          <w:p>
-            <w:pPr>
+            <w:shd w:color="auto" w:fill="auto" w:val="clear"/>
+          </w:tcPr>
+          <w:p>
+            <w:pPr>
+              <w:pStyle w:val="Normal"/>
               <w:tabs>
-                <w:tab w:val="left" w:pos="360"/>
+                <w:tab w:val="clear" w:pos="720"/>
+                <w:tab w:val="left" w:pos="360" w:leader="none"/>
               </w:tabs>
               <w:jc w:val="center"/>
               <w:rPr>
@@ -1529,11 +2037,11 @@
       </w:tr>
       <w:tr>
         <w:trPr>
-          <w:trHeight w:val="570"/>
+          <w:trHeight w:val="570" w:hRule="atLeast"/>
         </w:trPr>
         <w:tc>
           <w:tcPr>
-            <w:tcW w:w="10330" w:type="dxa"/>
+            <w:tcW w:w="10329" w:type="dxa"/>
             <w:gridSpan w:val="2"/>
             <w:tcBorders>
               <w:top w:val="single" w:sz="4" w:space="0" w:color="000000"/>
@@ -1541,12 +2049,14 @@
               <w:bottom w:val="single" w:sz="4" w:space="0" w:color="000000"/>
               <w:right w:val="single" w:sz="4" w:space="0" w:color="000000"/>
             </w:tcBorders>
-            <w:shd w:val="clear" w:color="auto" w:fill="auto"/>
-          </w:tcPr>
-          <w:p>
-            <w:pPr>
+            <w:shd w:color="auto" w:fill="auto" w:val="clear"/>
+          </w:tcPr>
+          <w:p>
+            <w:pPr>
+              <w:pStyle w:val="Normal"/>
               <w:tabs>
-                <w:tab w:val="left" w:pos="360"/>
+                <w:tab w:val="clear" w:pos="720"/>
+                <w:tab w:val="left" w:pos="360" w:leader="none"/>
               </w:tabs>
               <w:rPr>
                 <w:sz w:val="28"/>
@@ -1595,21 +2105,31 @@
         </w:tc>
       </w:tr>
     </w:tbl>
-    <w:p/>
     <w:p>
       <w:pPr>
-        <w:pStyle w:val="Ttulo1"/>
+        <w:pStyle w:val="Normal"/>
+        <w:rPr/>
+      </w:pPr>
+      <w:r>
+        <w:rPr/>
+      </w:r>
+    </w:p>
+    <w:p>
+      <w:pPr>
+        <w:pStyle w:val="Heading1"/>
         <w:numPr>
           <w:ilvl w:val="0"/>
           <w:numId w:val="1"/>
         </w:numPr>
+        <w:rPr/>
       </w:pPr>
       <w:r>
+        <w:rPr/>
         <w:t xml:space="preserve">Seção: </w:t>
       </w:r>
       <w:r>
         <w:rPr>
-          <w:b w:val="0"/>
+          <w:b w:val="false"/>
         </w:rPr>
         <w:t>Não Recebimento do pedido</w:t>
       </w:r>
@@ -1618,27 +2138,39 @@
       <w:tblPr>
         <w:tblStyle w:val="a2"/>
         <w:tblW w:w="10330" w:type="dxa"/>
+        <w:jc w:val="left"/>
         <w:tblInd w:w="-70" w:type="dxa"/>
         <w:tblLayout w:type="fixed"/>
-        <w:tblLook w:val="0000" w:firstRow="0" w:lastRow="0" w:firstColumn="0" w:lastColumn="0" w:noHBand="0" w:noVBand="0"/>
+        <w:tblCellMar>
+          <w:top w:w="0" w:type="dxa"/>
+          <w:left w:w="108" w:type="dxa"/>
+          <w:bottom w:w="0" w:type="dxa"/>
+          <w:right w:w="108" w:type="dxa"/>
+        </w:tblCellMar>
+        <w:tblLook w:val="0000" w:noHBand="0" w:noVBand="0" w:firstColumn="0" w:lastRow="0" w:lastColumn="0" w:firstRow="0"/>
       </w:tblPr>
       <w:tblGrid>
-        <w:gridCol w:w="2905"/>
+        <w:gridCol w:w="2904"/>
         <w:gridCol w:w="7425"/>
       </w:tblGrid>
       <w:tr>
-        <w:tc>
-          <w:tcPr>
-            <w:tcW w:w="2905" w:type="dxa"/>
-            <w:tcBorders>
-              <w:top w:val="single" w:sz="4" w:space="0" w:color="000000"/>
-              <w:left w:val="single" w:sz="4" w:space="0" w:color="000000"/>
-              <w:bottom w:val="single" w:sz="4" w:space="0" w:color="000000"/>
-              <w:right w:val="single" w:sz="4" w:space="0" w:color="000000"/>
-            </w:tcBorders>
-            <w:shd w:val="clear" w:color="auto" w:fill="auto"/>
-          </w:tcPr>
-          <w:p>
+        <w:trPr/>
+        <w:tc>
+          <w:tcPr>
+            <w:tcW w:w="2904" w:type="dxa"/>
+            <w:tcBorders>
+              <w:top w:val="single" w:sz="4" w:space="0" w:color="000000"/>
+              <w:left w:val="single" w:sz="4" w:space="0" w:color="000000"/>
+              <w:bottom w:val="single" w:sz="4" w:space="0" w:color="000000"/>
+              <w:right w:val="single" w:sz="4" w:space="0" w:color="000000"/>
+            </w:tcBorders>
+            <w:shd w:color="auto" w:fill="auto" w:val="clear"/>
+          </w:tcPr>
+          <w:p>
+            <w:pPr>
+              <w:pStyle w:val="Normal"/>
+              <w:rPr/>
+            </w:pPr>
             <w:r>
               <w:rPr>
                 <w:b/>
@@ -1658,9 +2190,13 @@
               <w:bottom w:val="single" w:sz="4" w:space="0" w:color="000000"/>
               <w:right w:val="single" w:sz="4" w:space="0" w:color="000000"/>
             </w:tcBorders>
-            <w:shd w:val="clear" w:color="auto" w:fill="auto"/>
-          </w:tcPr>
-          <w:p>
+            <w:shd w:color="auto" w:fill="auto" w:val="clear"/>
+          </w:tcPr>
+          <w:p>
+            <w:pPr>
+              <w:pStyle w:val="Normal"/>
+              <w:rPr/>
+            </w:pPr>
             <w:r>
               <w:rPr>
                 <w:sz w:val="28"/>
@@ -1673,11 +2209,11 @@
       </w:tr>
       <w:tr>
         <w:trPr>
-          <w:cantSplit/>
+          <w:cantSplit w:val="true"/>
         </w:trPr>
         <w:tc>
           <w:tcPr>
-            <w:tcW w:w="10330" w:type="dxa"/>
+            <w:tcW w:w="10329" w:type="dxa"/>
             <w:gridSpan w:val="2"/>
             <w:tcBorders>
               <w:top w:val="single" w:sz="4" w:space="0" w:color="000000"/>
@@ -1685,17 +2221,18 @@
               <w:bottom w:val="single" w:sz="4" w:space="0" w:color="000000"/>
               <w:right w:val="single" w:sz="4" w:space="0" w:color="000000"/>
             </w:tcBorders>
-            <w:shd w:val="clear" w:color="auto" w:fill="auto"/>
-          </w:tcPr>
-          <w:p>
-            <w:pPr>
-              <w:pStyle w:val="Ttulo2"/>
+            <w:shd w:color="auto" w:fill="auto" w:val="clear"/>
+          </w:tcPr>
+          <w:p>
+            <w:pPr>
+              <w:pStyle w:val="Heading2"/>
               <w:numPr>
                 <w:ilvl w:val="1"/>
                 <w:numId w:val="1"/>
               </w:numPr>
-            </w:pPr>
-            <w:bookmarkStart w:id="0" w:name="_heading=h.uzpyczazqcrp" w:colFirst="0" w:colLast="0"/>
+              <w:rPr/>
+            </w:pPr>
+            <w:bookmarkStart w:id="0" w:name="_heading=h.uzpyczazqcrp"/>
             <w:bookmarkEnd w:id="0"/>
             <w:r>
               <w:rPr>
@@ -1708,11 +2245,11 @@
       </w:tr>
       <w:tr>
         <w:trPr>
-          <w:trHeight w:val="1050"/>
+          <w:trHeight w:val="1050" w:hRule="atLeast"/>
         </w:trPr>
         <w:tc>
           <w:tcPr>
-            <w:tcW w:w="10330" w:type="dxa"/>
+            <w:tcW w:w="10329" w:type="dxa"/>
             <w:gridSpan w:val="2"/>
             <w:tcBorders>
               <w:top w:val="single" w:sz="4" w:space="0" w:color="000000"/>
@@ -1720,12 +2257,14 @@
               <w:bottom w:val="single" w:sz="4" w:space="0" w:color="000000"/>
               <w:right w:val="single" w:sz="4" w:space="0" w:color="000000"/>
             </w:tcBorders>
-            <w:shd w:val="clear" w:color="auto" w:fill="auto"/>
-          </w:tcPr>
-          <w:p>
-            <w:pPr>
+            <w:shd w:color="auto" w:fill="auto" w:val="clear"/>
+          </w:tcPr>
+          <w:p>
+            <w:pPr>
+              <w:pStyle w:val="Normal"/>
               <w:tabs>
-                <w:tab w:val="left" w:pos="360"/>
+                <w:tab w:val="clear" w:pos="720"/>
+                <w:tab w:val="left" w:pos="360" w:leader="none"/>
               </w:tabs>
               <w:rPr>
                 <w:sz w:val="28"/>
@@ -1742,8 +2281,10 @@
           </w:p>
           <w:p>
             <w:pPr>
+              <w:pStyle w:val="Normal"/>
               <w:tabs>
-                <w:tab w:val="left" w:pos="360"/>
+                <w:tab w:val="clear" w:pos="720"/>
+                <w:tab w:val="left" w:pos="360" w:leader="none"/>
               </w:tabs>
               <w:rPr>
                 <w:sz w:val="28"/>
@@ -1755,7 +2296,7 @@
                 <w:sz w:val="28"/>
                 <w:szCs w:val="28"/>
               </w:rPr>
-              <w:t>2. Sistema exibe tela de problemas com o pedido(</w:t>
+              <w:t>2. Sistema exibe tela de problemas com o pedido (</w:t>
             </w:r>
             <w:r>
               <w:rPr>
@@ -1775,8 +2316,10 @@
           </w:p>
           <w:p>
             <w:pPr>
+              <w:pStyle w:val="Normal"/>
               <w:tabs>
-                <w:tab w:val="left" w:pos="360"/>
+                <w:tab w:val="clear" w:pos="720"/>
+                <w:tab w:val="left" w:pos="360" w:leader="none"/>
               </w:tabs>
               <w:rPr>
                 <w:sz w:val="28"/>
@@ -1793,8 +2336,10 @@
           </w:p>
           <w:p>
             <w:pPr>
+              <w:pStyle w:val="Normal"/>
               <w:tabs>
-                <w:tab w:val="left" w:pos="360"/>
+                <w:tab w:val="clear" w:pos="720"/>
+                <w:tab w:val="left" w:pos="360" w:leader="none"/>
               </w:tabs>
               <w:rPr>
                 <w:sz w:val="28"/>
@@ -1813,11 +2358,11 @@
       </w:tr>
       <w:tr>
         <w:trPr>
-          <w:trHeight w:val="435"/>
+          <w:trHeight w:val="435" w:hRule="atLeast"/>
         </w:trPr>
         <w:tc>
           <w:tcPr>
-            <w:tcW w:w="10330" w:type="dxa"/>
+            <w:tcW w:w="10329" w:type="dxa"/>
             <w:gridSpan w:val="2"/>
             <w:tcBorders>
               <w:top w:val="single" w:sz="4" w:space="0" w:color="000000"/>
@@ -1825,12 +2370,14 @@
               <w:bottom w:val="single" w:sz="4" w:space="0" w:color="000000"/>
               <w:right w:val="single" w:sz="4" w:space="0" w:color="000000"/>
             </w:tcBorders>
-            <w:shd w:val="clear" w:color="auto" w:fill="auto"/>
-          </w:tcPr>
-          <w:p>
-            <w:pPr>
+            <w:shd w:color="auto" w:fill="auto" w:val="clear"/>
+          </w:tcPr>
+          <w:p>
+            <w:pPr>
+              <w:pStyle w:val="Normal"/>
               <w:tabs>
-                <w:tab w:val="left" w:pos="360"/>
+                <w:tab w:val="clear" w:pos="720"/>
+                <w:tab w:val="left" w:pos="360" w:leader="none"/>
               </w:tabs>
               <w:jc w:val="center"/>
               <w:rPr>
@@ -1852,11 +2399,11 @@
       </w:tr>
       <w:tr>
         <w:trPr>
-          <w:trHeight w:val="435"/>
+          <w:trHeight w:val="435" w:hRule="atLeast"/>
         </w:trPr>
         <w:tc>
           <w:tcPr>
-            <w:tcW w:w="10330" w:type="dxa"/>
+            <w:tcW w:w="10329" w:type="dxa"/>
             <w:gridSpan w:val="2"/>
             <w:tcBorders>
               <w:top w:val="single" w:sz="4" w:space="0" w:color="000000"/>
@@ -1864,12 +2411,14 @@
               <w:bottom w:val="single" w:sz="4" w:space="0" w:color="000000"/>
               <w:right w:val="single" w:sz="4" w:space="0" w:color="000000"/>
             </w:tcBorders>
-            <w:shd w:val="clear" w:color="auto" w:fill="auto"/>
-          </w:tcPr>
-          <w:p>
-            <w:pPr>
+            <w:shd w:color="auto" w:fill="auto" w:val="clear"/>
+          </w:tcPr>
+          <w:p>
+            <w:pPr>
+              <w:pStyle w:val="Normal"/>
               <w:tabs>
-                <w:tab w:val="left" w:pos="360"/>
+                <w:tab w:val="clear" w:pos="720"/>
+                <w:tab w:val="left" w:pos="360" w:leader="none"/>
               </w:tabs>
               <w:rPr>
                 <w:sz w:val="28"/>
@@ -1897,7 +2446,23 @@
                 <w:sz w:val="28"/>
                 <w:szCs w:val="28"/>
               </w:rPr>
-              <w:t>Tela_M1</w:t>
+              <w:t>Tela_M</w:t>
+            </w:r>
+            <w:r>
+              <w:rPr>
+                <w:color w:val="FF0000"/>
+                <w:sz w:val="28"/>
+                <w:szCs w:val="28"/>
+              </w:rPr>
+              <w:t>0</w:t>
+            </w:r>
+            <w:r>
+              <w:rPr>
+                <w:color w:val="FF0000"/>
+                <w:sz w:val="28"/>
+                <w:szCs w:val="28"/>
+              </w:rPr>
+              <w:t>1</w:t>
             </w:r>
             <w:r>
               <w:rPr>
@@ -1911,11 +2476,11 @@
       </w:tr>
       <w:tr>
         <w:trPr>
-          <w:trHeight w:val="435"/>
+          <w:trHeight w:val="435" w:hRule="atLeast"/>
         </w:trPr>
         <w:tc>
           <w:tcPr>
-            <w:tcW w:w="10330" w:type="dxa"/>
+            <w:tcW w:w="10329" w:type="dxa"/>
             <w:gridSpan w:val="2"/>
             <w:tcBorders>
               <w:top w:val="single" w:sz="4" w:space="0" w:color="000000"/>
@@ -1923,12 +2488,14 @@
               <w:bottom w:val="single" w:sz="4" w:space="0" w:color="000000"/>
               <w:right w:val="single" w:sz="4" w:space="0" w:color="000000"/>
             </w:tcBorders>
-            <w:shd w:val="clear" w:color="auto" w:fill="auto"/>
-          </w:tcPr>
-          <w:p>
-            <w:pPr>
+            <w:shd w:color="auto" w:fill="auto" w:val="clear"/>
+          </w:tcPr>
+          <w:p>
+            <w:pPr>
+              <w:pStyle w:val="Normal"/>
               <w:tabs>
-                <w:tab w:val="left" w:pos="360"/>
+                <w:tab w:val="clear" w:pos="720"/>
+                <w:tab w:val="left" w:pos="360" w:leader="none"/>
               </w:tabs>
               <w:jc w:val="center"/>
               <w:rPr>
@@ -1950,11 +2517,11 @@
       </w:tr>
       <w:tr>
         <w:trPr>
-          <w:trHeight w:val="435"/>
+          <w:trHeight w:val="435" w:hRule="atLeast"/>
         </w:trPr>
         <w:tc>
           <w:tcPr>
-            <w:tcW w:w="10330" w:type="dxa"/>
+            <w:tcW w:w="10329" w:type="dxa"/>
             <w:gridSpan w:val="2"/>
             <w:tcBorders>
               <w:top w:val="single" w:sz="4" w:space="0" w:color="000000"/>
@@ -1962,12 +2529,14 @@
               <w:bottom w:val="single" w:sz="4" w:space="0" w:color="000000"/>
               <w:right w:val="single" w:sz="4" w:space="0" w:color="000000"/>
             </w:tcBorders>
-            <w:shd w:val="clear" w:color="auto" w:fill="auto"/>
-          </w:tcPr>
-          <w:p>
-            <w:pPr>
+            <w:shd w:color="auto" w:fill="auto" w:val="clear"/>
+          </w:tcPr>
+          <w:p>
+            <w:pPr>
+              <w:pStyle w:val="Normal"/>
               <w:tabs>
-                <w:tab w:val="left" w:pos="360"/>
+                <w:tab w:val="clear" w:pos="720"/>
+                <w:tab w:val="left" w:pos="360" w:leader="none"/>
               </w:tabs>
               <w:rPr>
                 <w:sz w:val="28"/>
@@ -2010,14 +2579,7 @@
                 <w:sz w:val="28"/>
                 <w:szCs w:val="28"/>
               </w:rPr>
-              <w:t>)</w:t>
-            </w:r>
-            <w:r>
-              <w:rPr>
-                <w:sz w:val="28"/>
-                <w:szCs w:val="28"/>
-              </w:rPr>
-              <w:t>.</w:t>
+              <w:t>).</w:t>
             </w:r>
             <w:bookmarkStart w:id="1" w:name="_GoBack"/>
             <w:bookmarkEnd w:id="1"/>
@@ -2025,23 +2587,55 @@
         </w:tc>
       </w:tr>
     </w:tbl>
-    <w:p/>
-    <w:p/>
-    <w:p/>
+    <w:p>
+      <w:pPr>
+        <w:pStyle w:val="Normal"/>
+        <w:rPr/>
+      </w:pPr>
+      <w:r>
+        <w:rPr/>
+      </w:r>
+    </w:p>
+    <w:p>
+      <w:pPr>
+        <w:pStyle w:val="Normal"/>
+        <w:rPr/>
+      </w:pPr>
+      <w:r>
+        <w:rPr/>
+      </w:r>
+    </w:p>
+    <w:p>
+      <w:pPr>
+        <w:pStyle w:val="Normal"/>
+        <w:rPr/>
+      </w:pPr>
+      <w:r>
+        <w:rPr/>
+      </w:r>
+    </w:p>
     <w:tbl>
       <w:tblPr>
         <w:tblStyle w:val="a3"/>
         <w:tblW w:w="10548" w:type="dxa"/>
+        <w:jc w:val="left"/>
         <w:tblInd w:w="-108" w:type="dxa"/>
         <w:tblLayout w:type="fixed"/>
-        <w:tblLook w:val="0000" w:firstRow="0" w:lastRow="0" w:firstColumn="0" w:lastColumn="0" w:noHBand="0" w:noVBand="0"/>
+        <w:tblCellMar>
+          <w:top w:w="0" w:type="dxa"/>
+          <w:left w:w="108" w:type="dxa"/>
+          <w:bottom w:w="0" w:type="dxa"/>
+          <w:right w:w="108" w:type="dxa"/>
+        </w:tblCellMar>
+        <w:tblLook w:val="0000" w:noHBand="0" w:noVBand="0" w:firstColumn="0" w:lastRow="0" w:lastColumn="0" w:firstRow="0"/>
       </w:tblPr>
       <w:tblGrid>
-        <w:gridCol w:w="2628"/>
-        <w:gridCol w:w="1800"/>
-        <w:gridCol w:w="6120"/>
+        <w:gridCol w:w="2627"/>
+        <w:gridCol w:w="2128"/>
+        <w:gridCol w:w="5793"/>
       </w:tblGrid>
       <w:tr>
+        <w:trPr/>
         <w:tc>
           <w:tcPr>
             <w:tcW w:w="10548" w:type="dxa"/>
@@ -2052,11 +2646,13 @@
               <w:bottom w:val="single" w:sz="4" w:space="0" w:color="000000"/>
               <w:right w:val="single" w:sz="4" w:space="0" w:color="000000"/>
             </w:tcBorders>
-            <w:shd w:val="clear" w:color="auto" w:fill="auto"/>
-          </w:tcPr>
-          <w:p>
-            <w:pPr>
+            <w:shd w:color="auto" w:fill="auto" w:val="clear"/>
+          </w:tcPr>
+          <w:p>
+            <w:pPr>
+              <w:pStyle w:val="Normal"/>
               <w:jc w:val="center"/>
+              <w:rPr/>
             </w:pPr>
             <w:r>
               <w:rPr>
@@ -2070,296 +2666,559 @@
         </w:tc>
       </w:tr>
       <w:tr>
-        <w:tc>
-          <w:tcPr>
-            <w:tcW w:w="2628" w:type="dxa"/>
-            <w:tcBorders>
-              <w:top w:val="single" w:sz="4" w:space="0" w:color="000000"/>
-              <w:left w:val="single" w:sz="4" w:space="0" w:color="000000"/>
-              <w:bottom w:val="single" w:sz="4" w:space="0" w:color="000000"/>
-              <w:right w:val="single" w:sz="4" w:space="0" w:color="000000"/>
-            </w:tcBorders>
-            <w:shd w:val="clear" w:color="auto" w:fill="auto"/>
-          </w:tcPr>
-          <w:p>
-            <w:pPr>
+        <w:trPr/>
+        <w:tc>
+          <w:tcPr>
+            <w:tcW w:w="2627" w:type="dxa"/>
+            <w:tcBorders>
+              <w:top w:val="single" w:sz="4" w:space="0" w:color="000000"/>
+              <w:left w:val="single" w:sz="4" w:space="0" w:color="000000"/>
+              <w:bottom w:val="single" w:sz="4" w:space="0" w:color="000000"/>
+              <w:right w:val="single" w:sz="4" w:space="0" w:color="000000"/>
+            </w:tcBorders>
+            <w:shd w:color="auto" w:fill="auto" w:val="clear"/>
+          </w:tcPr>
+          <w:p>
+            <w:pPr>
+              <w:pStyle w:val="Normal"/>
               <w:jc w:val="center"/>
-            </w:pPr>
-            <w:r>
+              <w:rPr/>
+            </w:pPr>
+            <w:r>
+              <w:rPr/>
               <w:t>Data</w:t>
             </w:r>
           </w:p>
         </w:tc>
         <w:tc>
           <w:tcPr>
-            <w:tcW w:w="1800" w:type="dxa"/>
-            <w:tcBorders>
-              <w:top w:val="single" w:sz="4" w:space="0" w:color="000000"/>
-              <w:left w:val="single" w:sz="4" w:space="0" w:color="000000"/>
-              <w:bottom w:val="single" w:sz="4" w:space="0" w:color="000000"/>
-              <w:right w:val="single" w:sz="4" w:space="0" w:color="000000"/>
-            </w:tcBorders>
-            <w:shd w:val="clear" w:color="auto" w:fill="auto"/>
-          </w:tcPr>
-          <w:p>
-            <w:pPr>
+            <w:tcW w:w="2128" w:type="dxa"/>
+            <w:tcBorders>
+              <w:top w:val="single" w:sz="4" w:space="0" w:color="000000"/>
+              <w:left w:val="single" w:sz="4" w:space="0" w:color="000000"/>
+              <w:bottom w:val="single" w:sz="4" w:space="0" w:color="000000"/>
+              <w:right w:val="single" w:sz="4" w:space="0" w:color="000000"/>
+            </w:tcBorders>
+            <w:shd w:color="auto" w:fill="auto" w:val="clear"/>
+          </w:tcPr>
+          <w:p>
+            <w:pPr>
+              <w:pStyle w:val="Normal"/>
               <w:jc w:val="center"/>
-            </w:pPr>
-            <w:r>
+              <w:rPr/>
+            </w:pPr>
+            <w:r>
+              <w:rPr/>
               <w:t>Pessoa</w:t>
             </w:r>
           </w:p>
         </w:tc>
         <w:tc>
           <w:tcPr>
-            <w:tcW w:w="6120" w:type="dxa"/>
-            <w:tcBorders>
-              <w:top w:val="single" w:sz="4" w:space="0" w:color="000000"/>
-              <w:left w:val="single" w:sz="4" w:space="0" w:color="000000"/>
-              <w:bottom w:val="single" w:sz="4" w:space="0" w:color="000000"/>
-              <w:right w:val="single" w:sz="4" w:space="0" w:color="000000"/>
-            </w:tcBorders>
-            <w:shd w:val="clear" w:color="auto" w:fill="auto"/>
-          </w:tcPr>
-          <w:p>
-            <w:pPr>
+            <w:tcW w:w="5793" w:type="dxa"/>
+            <w:tcBorders>
+              <w:top w:val="single" w:sz="4" w:space="0" w:color="000000"/>
+              <w:left w:val="single" w:sz="4" w:space="0" w:color="000000"/>
+              <w:bottom w:val="single" w:sz="4" w:space="0" w:color="000000"/>
+              <w:right w:val="single" w:sz="4" w:space="0" w:color="000000"/>
+            </w:tcBorders>
+            <w:shd w:color="auto" w:fill="auto" w:val="clear"/>
+          </w:tcPr>
+          <w:p>
+            <w:pPr>
+              <w:pStyle w:val="Normal"/>
               <w:jc w:val="center"/>
-            </w:pPr>
-            <w:r>
+              <w:rPr/>
+            </w:pPr>
+            <w:r>
+              <w:rPr/>
               <w:t>Alteração</w:t>
             </w:r>
           </w:p>
         </w:tc>
       </w:tr>
       <w:tr>
-        <w:tc>
-          <w:tcPr>
-            <w:tcW w:w="2628" w:type="dxa"/>
-            <w:tcBorders>
-              <w:top w:val="single" w:sz="4" w:space="0" w:color="000000"/>
-              <w:left w:val="single" w:sz="4" w:space="0" w:color="000000"/>
-              <w:bottom w:val="single" w:sz="4" w:space="0" w:color="000000"/>
-              <w:right w:val="single" w:sz="4" w:space="0" w:color="000000"/>
-            </w:tcBorders>
-            <w:shd w:val="clear" w:color="auto" w:fill="auto"/>
-          </w:tcPr>
-          <w:p>
-            <w:pPr>
+        <w:trPr/>
+        <w:tc>
+          <w:tcPr>
+            <w:tcW w:w="2627" w:type="dxa"/>
+            <w:tcBorders>
+              <w:top w:val="single" w:sz="4" w:space="0" w:color="000000"/>
+              <w:left w:val="single" w:sz="4" w:space="0" w:color="000000"/>
+              <w:bottom w:val="single" w:sz="4" w:space="0" w:color="000000"/>
+              <w:right w:val="single" w:sz="4" w:space="0" w:color="000000"/>
+            </w:tcBorders>
+            <w:shd w:color="auto" w:fill="auto" w:val="clear"/>
+          </w:tcPr>
+          <w:p>
+            <w:pPr>
+              <w:pStyle w:val="Normal"/>
               <w:jc w:val="center"/>
-            </w:pPr>
-            <w:r>
+              <w:rPr/>
+            </w:pPr>
+            <w:r>
+              <w:rPr/>
               <w:t>28/08/2025</w:t>
             </w:r>
           </w:p>
         </w:tc>
         <w:tc>
           <w:tcPr>
-            <w:tcW w:w="1800" w:type="dxa"/>
-            <w:tcBorders>
-              <w:top w:val="single" w:sz="4" w:space="0" w:color="000000"/>
-              <w:left w:val="single" w:sz="4" w:space="0" w:color="000000"/>
-              <w:bottom w:val="single" w:sz="4" w:space="0" w:color="000000"/>
-              <w:right w:val="single" w:sz="4" w:space="0" w:color="000000"/>
-            </w:tcBorders>
-            <w:shd w:val="clear" w:color="auto" w:fill="auto"/>
-          </w:tcPr>
-          <w:p>
-            <w:pPr>
+            <w:tcW w:w="2128" w:type="dxa"/>
+            <w:tcBorders>
+              <w:top w:val="single" w:sz="4" w:space="0" w:color="000000"/>
+              <w:left w:val="single" w:sz="4" w:space="0" w:color="000000"/>
+              <w:bottom w:val="single" w:sz="4" w:space="0" w:color="000000"/>
+              <w:right w:val="single" w:sz="4" w:space="0" w:color="000000"/>
+            </w:tcBorders>
+            <w:shd w:color="auto" w:fill="auto" w:val="clear"/>
+          </w:tcPr>
+          <w:p>
+            <w:pPr>
+              <w:pStyle w:val="Normal"/>
               <w:jc w:val="center"/>
-            </w:pPr>
-            <w:r>
+              <w:rPr/>
+            </w:pPr>
+            <w:r>
+              <w:rPr/>
               <w:t>Paulo Henrique</w:t>
             </w:r>
           </w:p>
         </w:tc>
         <w:tc>
           <w:tcPr>
-            <w:tcW w:w="6120" w:type="dxa"/>
-            <w:tcBorders>
-              <w:top w:val="single" w:sz="4" w:space="0" w:color="000000"/>
-              <w:left w:val="single" w:sz="4" w:space="0" w:color="000000"/>
-              <w:bottom w:val="single" w:sz="4" w:space="0" w:color="000000"/>
-              <w:right w:val="single" w:sz="4" w:space="0" w:color="000000"/>
-            </w:tcBorders>
-            <w:shd w:val="clear" w:color="auto" w:fill="auto"/>
-          </w:tcPr>
-          <w:p>
-            <w:pPr>
+            <w:tcW w:w="5793" w:type="dxa"/>
+            <w:tcBorders>
+              <w:top w:val="single" w:sz="4" w:space="0" w:color="000000"/>
+              <w:left w:val="single" w:sz="4" w:space="0" w:color="000000"/>
+              <w:bottom w:val="single" w:sz="4" w:space="0" w:color="000000"/>
+              <w:right w:val="single" w:sz="4" w:space="0" w:color="000000"/>
+            </w:tcBorders>
+            <w:shd w:color="auto" w:fill="auto" w:val="clear"/>
+          </w:tcPr>
+          <w:p>
+            <w:pPr>
+              <w:pStyle w:val="Normal"/>
               <w:jc w:val="center"/>
-            </w:pPr>
-            <w:r>
+              <w:rPr/>
+            </w:pPr>
+            <w:r>
+              <w:rPr/>
               <w:t>Criação caso de uso</w:t>
             </w:r>
           </w:p>
         </w:tc>
       </w:tr>
       <w:tr>
-        <w:tc>
-          <w:tcPr>
-            <w:tcW w:w="2628" w:type="dxa"/>
-            <w:tcBorders>
-              <w:top w:val="single" w:sz="4" w:space="0" w:color="000000"/>
-              <w:left w:val="single" w:sz="4" w:space="0" w:color="000000"/>
-              <w:bottom w:val="single" w:sz="4" w:space="0" w:color="000000"/>
-              <w:right w:val="single" w:sz="4" w:space="0" w:color="000000"/>
-            </w:tcBorders>
-            <w:shd w:val="clear" w:color="auto" w:fill="auto"/>
-          </w:tcPr>
-          <w:p>
-            <w:pPr>
+        <w:trPr/>
+        <w:tc>
+          <w:tcPr>
+            <w:tcW w:w="2627" w:type="dxa"/>
+            <w:tcBorders>
+              <w:top w:val="single" w:sz="4" w:space="0" w:color="000000"/>
+              <w:left w:val="single" w:sz="4" w:space="0" w:color="000000"/>
+              <w:bottom w:val="single" w:sz="4" w:space="0" w:color="000000"/>
+              <w:right w:val="single" w:sz="4" w:space="0" w:color="000000"/>
+            </w:tcBorders>
+            <w:shd w:color="auto" w:fill="auto" w:val="clear"/>
+          </w:tcPr>
+          <w:p>
+            <w:pPr>
+              <w:pStyle w:val="Normal"/>
               <w:jc w:val="center"/>
-            </w:pPr>
-            <w:r>
+              <w:rPr/>
+            </w:pPr>
+            <w:r>
+              <w:rPr/>
               <w:t>29/08/2025</w:t>
             </w:r>
           </w:p>
         </w:tc>
         <w:tc>
           <w:tcPr>
-            <w:tcW w:w="1800" w:type="dxa"/>
-            <w:tcBorders>
-              <w:top w:val="single" w:sz="4" w:space="0" w:color="000000"/>
-              <w:left w:val="single" w:sz="4" w:space="0" w:color="000000"/>
-              <w:bottom w:val="single" w:sz="4" w:space="0" w:color="000000"/>
-              <w:right w:val="single" w:sz="4" w:space="0" w:color="000000"/>
-            </w:tcBorders>
-            <w:shd w:val="clear" w:color="auto" w:fill="auto"/>
-          </w:tcPr>
-          <w:p>
-            <w:pPr>
+            <w:tcW w:w="2128" w:type="dxa"/>
+            <w:tcBorders>
+              <w:top w:val="single" w:sz="4" w:space="0" w:color="000000"/>
+              <w:left w:val="single" w:sz="4" w:space="0" w:color="000000"/>
+              <w:bottom w:val="single" w:sz="4" w:space="0" w:color="000000"/>
+              <w:right w:val="single" w:sz="4" w:space="0" w:color="000000"/>
+            </w:tcBorders>
+            <w:shd w:color="auto" w:fill="auto" w:val="clear"/>
+          </w:tcPr>
+          <w:p>
+            <w:pPr>
+              <w:pStyle w:val="Normal"/>
               <w:jc w:val="center"/>
-            </w:pPr>
-            <w:proofErr w:type="spellStart"/>
-            <w:r>
-              <w:t>Kauan</w:t>
-            </w:r>
-            <w:proofErr w:type="spellEnd"/>
-            <w:r>
-              <w:t xml:space="preserve"> Felipe</w:t>
-            </w:r>
-          </w:p>
-        </w:tc>
-        <w:tc>
-          <w:tcPr>
-            <w:tcW w:w="6120" w:type="dxa"/>
-            <w:tcBorders>
-              <w:top w:val="single" w:sz="4" w:space="0" w:color="000000"/>
-              <w:left w:val="single" w:sz="4" w:space="0" w:color="000000"/>
-              <w:bottom w:val="single" w:sz="4" w:space="0" w:color="000000"/>
-              <w:right w:val="single" w:sz="4" w:space="0" w:color="000000"/>
-            </w:tcBorders>
-            <w:shd w:val="clear" w:color="auto" w:fill="auto"/>
-          </w:tcPr>
-          <w:p>
-            <w:pPr>
+              <w:rPr/>
+            </w:pPr>
+            <w:r>
+              <w:rPr/>
+              <w:t>Kauan Felipe</w:t>
+            </w:r>
+          </w:p>
+        </w:tc>
+        <w:tc>
+          <w:tcPr>
+            <w:tcW w:w="5793" w:type="dxa"/>
+            <w:tcBorders>
+              <w:top w:val="single" w:sz="4" w:space="0" w:color="000000"/>
+              <w:left w:val="single" w:sz="4" w:space="0" w:color="000000"/>
+              <w:bottom w:val="single" w:sz="4" w:space="0" w:color="000000"/>
+              <w:right w:val="single" w:sz="4" w:space="0" w:color="000000"/>
+            </w:tcBorders>
+            <w:shd w:color="auto" w:fill="auto" w:val="clear"/>
+          </w:tcPr>
+          <w:p>
+            <w:pPr>
+              <w:pStyle w:val="Normal"/>
               <w:jc w:val="center"/>
-            </w:pPr>
-            <w:r>
+              <w:rPr/>
+            </w:pPr>
+            <w:r>
+              <w:rPr/>
               <w:t>Adição dos Fluxos Alternativos</w:t>
             </w:r>
           </w:p>
         </w:tc>
       </w:tr>
       <w:tr>
-        <w:tc>
-          <w:tcPr>
-            <w:tcW w:w="2628" w:type="dxa"/>
-            <w:tcBorders>
-              <w:top w:val="single" w:sz="4" w:space="0" w:color="000000"/>
-              <w:left w:val="single" w:sz="4" w:space="0" w:color="000000"/>
-              <w:bottom w:val="single" w:sz="4" w:space="0" w:color="000000"/>
-              <w:right w:val="single" w:sz="4" w:space="0" w:color="000000"/>
-            </w:tcBorders>
-            <w:shd w:val="clear" w:color="auto" w:fill="auto"/>
-          </w:tcPr>
-          <w:p>
-            <w:pPr>
+        <w:trPr/>
+        <w:tc>
+          <w:tcPr>
+            <w:tcW w:w="2627" w:type="dxa"/>
+            <w:tcBorders>
+              <w:top w:val="single" w:sz="4" w:space="0" w:color="000000"/>
+              <w:left w:val="single" w:sz="4" w:space="0" w:color="000000"/>
+              <w:bottom w:val="single" w:sz="4" w:space="0" w:color="000000"/>
+              <w:right w:val="single" w:sz="4" w:space="0" w:color="000000"/>
+            </w:tcBorders>
+            <w:shd w:color="auto" w:fill="auto" w:val="clear"/>
+          </w:tcPr>
+          <w:p>
+            <w:pPr>
+              <w:pStyle w:val="Normal"/>
               <w:jc w:val="center"/>
-            </w:pPr>
-            <w:r>
+              <w:rPr/>
+            </w:pPr>
+            <w:r>
+              <w:rPr/>
               <w:t>31/10/2025</w:t>
             </w:r>
           </w:p>
         </w:tc>
         <w:tc>
           <w:tcPr>
-            <w:tcW w:w="1800" w:type="dxa"/>
-            <w:tcBorders>
-              <w:top w:val="single" w:sz="4" w:space="0" w:color="000000"/>
-              <w:left w:val="single" w:sz="4" w:space="0" w:color="000000"/>
-              <w:bottom w:val="single" w:sz="4" w:space="0" w:color="000000"/>
-              <w:right w:val="single" w:sz="4" w:space="0" w:color="000000"/>
-            </w:tcBorders>
-            <w:shd w:val="clear" w:color="auto" w:fill="auto"/>
-          </w:tcPr>
-          <w:p>
-            <w:pPr>
+            <w:tcW w:w="2128" w:type="dxa"/>
+            <w:tcBorders>
+              <w:top w:val="single" w:sz="4" w:space="0" w:color="000000"/>
+              <w:left w:val="single" w:sz="4" w:space="0" w:color="000000"/>
+              <w:bottom w:val="single" w:sz="4" w:space="0" w:color="000000"/>
+              <w:right w:val="single" w:sz="4" w:space="0" w:color="000000"/>
+            </w:tcBorders>
+            <w:shd w:color="auto" w:fill="auto" w:val="clear"/>
+          </w:tcPr>
+          <w:p>
+            <w:pPr>
+              <w:pStyle w:val="Normal"/>
               <w:jc w:val="center"/>
-            </w:pPr>
-            <w:r>
+              <w:rPr/>
+            </w:pPr>
+            <w:r>
+              <w:rPr/>
               <w:t>Leandro Carvalho</w:t>
             </w:r>
           </w:p>
         </w:tc>
         <w:tc>
           <w:tcPr>
-            <w:tcW w:w="6120" w:type="dxa"/>
-            <w:tcBorders>
-              <w:top w:val="single" w:sz="4" w:space="0" w:color="000000"/>
-              <w:left w:val="single" w:sz="4" w:space="0" w:color="000000"/>
-              <w:bottom w:val="single" w:sz="4" w:space="0" w:color="000000"/>
-              <w:right w:val="single" w:sz="4" w:space="0" w:color="000000"/>
-            </w:tcBorders>
-            <w:shd w:val="clear" w:color="auto" w:fill="auto"/>
-          </w:tcPr>
-          <w:p>
-            <w:pPr>
+            <w:tcW w:w="5793" w:type="dxa"/>
+            <w:tcBorders>
+              <w:top w:val="single" w:sz="4" w:space="0" w:color="000000"/>
+              <w:left w:val="single" w:sz="4" w:space="0" w:color="000000"/>
+              <w:bottom w:val="single" w:sz="4" w:space="0" w:color="000000"/>
+              <w:right w:val="single" w:sz="4" w:space="0" w:color="000000"/>
+            </w:tcBorders>
+            <w:shd w:color="auto" w:fill="auto" w:val="clear"/>
+          </w:tcPr>
+          <w:p>
+            <w:pPr>
+              <w:pStyle w:val="Normal"/>
               <w:jc w:val="center"/>
-            </w:pPr>
-            <w:r>
-              <w:t>Adição de Fluxo</w:t>
-            </w:r>
-            <w:r>
-              <w:t>s</w:t>
-            </w:r>
-            <w:r>
-              <w:t xml:space="preserve"> de Exceção.</w:t>
+              <w:rPr/>
+            </w:pPr>
+            <w:r>
+              <w:rPr/>
+              <w:t>Adição de Fluxos de Exceção.</w:t>
+            </w:r>
+          </w:p>
+        </w:tc>
+      </w:tr>
+      <w:tr>
+        <w:trPr/>
+        <w:tc>
+          <w:tcPr>
+            <w:tcW w:w="2627" w:type="dxa"/>
+            <w:tcBorders>
+              <w:left w:val="single" w:sz="4" w:space="0" w:color="000000"/>
+              <w:bottom w:val="single" w:sz="4" w:space="0" w:color="000000"/>
+              <w:right w:val="single" w:sz="4" w:space="0" w:color="000000"/>
+            </w:tcBorders>
+            <w:shd w:color="auto" w:fill="auto" w:val="clear"/>
+          </w:tcPr>
+          <w:p>
+            <w:pPr>
+              <w:pStyle w:val="Normal"/>
+              <w:jc w:val="center"/>
+              <w:rPr/>
+            </w:pPr>
+            <w:r>
+              <w:rPr/>
+              <w:t>07/11/2025</w:t>
+            </w:r>
+          </w:p>
+        </w:tc>
+        <w:tc>
+          <w:tcPr>
+            <w:tcW w:w="2128" w:type="dxa"/>
+            <w:tcBorders>
+              <w:left w:val="single" w:sz="4" w:space="0" w:color="000000"/>
+              <w:bottom w:val="single" w:sz="4" w:space="0" w:color="000000"/>
+              <w:right w:val="single" w:sz="4" w:space="0" w:color="000000"/>
+            </w:tcBorders>
+            <w:shd w:color="auto" w:fill="auto" w:val="clear"/>
+          </w:tcPr>
+          <w:p>
+            <w:pPr>
+              <w:pStyle w:val="Normal"/>
+              <w:jc w:val="center"/>
+              <w:rPr/>
+            </w:pPr>
+            <w:r>
+              <w:rPr/>
+              <w:t>Matheus Calixto</w:t>
+            </w:r>
+          </w:p>
+        </w:tc>
+        <w:tc>
+          <w:tcPr>
+            <w:tcW w:w="5793" w:type="dxa"/>
+            <w:tcBorders>
+              <w:left w:val="single" w:sz="4" w:space="0" w:color="000000"/>
+              <w:bottom w:val="single" w:sz="4" w:space="0" w:color="000000"/>
+              <w:right w:val="single" w:sz="4" w:space="0" w:color="000000"/>
+            </w:tcBorders>
+            <w:shd w:color="auto" w:fill="auto" w:val="clear"/>
+          </w:tcPr>
+          <w:p>
+            <w:pPr>
+              <w:pStyle w:val="Normal"/>
+              <w:jc w:val="center"/>
+              <w:rPr/>
+            </w:pPr>
+            <w:r>
+              <w:rPr/>
+              <w:t>Adição e correção de fluxos de exceção e alternativos</w:t>
             </w:r>
           </w:p>
         </w:tc>
       </w:tr>
     </w:tbl>
     <w:p>
+      <w:pPr>
+        <w:pStyle w:val="Normal"/>
+        <w:rPr/>
+      </w:pPr>
       <w:r>
+        <w:rPr/>
         <w:tab/>
       </w:r>
     </w:p>
     <w:sectPr>
+      <w:type w:val="nextPage"/>
       <w:pgSz w:w="11906" w:h="16838"/>
-      <w:pgMar w:top="1418" w:right="851" w:bottom="1418" w:left="851" w:header="720" w:footer="720" w:gutter="0"/>
-      <w:pgNumType w:start="1"/>
-      <w:cols w:space="720"/>
+      <w:pgMar w:left="851" w:right="851" w:gutter="0" w:header="0" w:top="1418" w:footer="0" w:bottom="1418"/>
+      <w:pgNumType w:start="1" w:fmt="decimal"/>
+      <w:formProt w:val="false"/>
+      <w:textDirection w:val="lrTb"/>
+      <w:docGrid w:type="default" w:linePitch="100" w:charSpace="0"/>
     </w:sectPr>
   </w:body>
 </w:document>
 </file>
 
 <file path=word/numbering.xml><?xml version="1.0" encoding="utf-8"?>
-<w:numbering xmlns:wpc="http://schemas.microsoft.com/office/word/2010/wordprocessingCanvas" xmlns:cx="http://schemas.microsoft.com/office/drawing/2014/chartex" xmlns:cx1="http://schemas.microsoft.com/office/drawing/2015/9/8/chartex" xmlns:cx2="http://schemas.microsoft.com/office/drawing/2015/10/21/chartex" xmlns:cx3="http://schemas.microsoft.com/office/drawing/2016/5/9/chartex" xmlns:cx4="http://schemas.microsoft.com/office/drawing/2016/5/10/chartex" xmlns:cx5="http://schemas.microsoft.com/office/drawing/2016/5/11/chartex" xmlns:cx6="http://schemas.microsoft.com/office/drawing/2016/5/12/chartex" xmlns:cx7="http://schemas.microsoft.com/office/drawing/2016/5/13/chartex" xmlns:cx8="http://schemas.microsoft.com/office/drawing/2016/5/14/chartex" xmlns:mc="http://schemas.openxmlformats.org/markup-compatibility/2006" xmlns:aink="http://schemas.microsoft.com/office/drawing/2016/ink" xmlns:am3d="http://schemas.microsoft.com/office/drawing/2017/model3d" xmlns:o="urn:schemas-microsoft-com:office:office" xmlns:r="http://schemas.openxmlformats.org/officeDocument/2006/relationships" xmlns:m="http://schemas.openxmlformats.org/officeDocument/2006/math" xmlns:v="urn:schemas-microsoft-com:vml" xmlns:wp14="http://schemas.microsoft.com/office/word/2010/wordprocessingDrawing" xmlns:wp="http://schemas.openxmlformats.org/drawingml/2006/wordprocessingDrawing" xmlns:w10="urn:schemas-microsoft-com:office:word" xmlns:w="http://schemas.openxmlformats.org/wordprocessingml/2006/main" xmlns:w14="http://schemas.microsoft.com/office/word/2010/wordml" xmlns:w15="http://schemas.microsoft.com/office/word/2012/wordml" xmlns:w16cex="http://schemas.microsoft.com/office/word/2018/wordml/cex" xmlns:w16cid="http://schemas.microsoft.com/office/word/2016/wordml/cid" xmlns:w16="http://schemas.microsoft.com/office/word/2018/wordml" xmlns:w16se="http://schemas.microsoft.com/office/word/2015/wordml/symex" xmlns:wpg="http://schemas.microsoft.com/office/word/2010/wordprocessingGroup" xmlns:wpi="http://schemas.microsoft.com/office/word/2010/wordprocessingInk" xmlns:wne="http://schemas.microsoft.com/office/word/2006/wordml" xmlns:wps="http://schemas.microsoft.com/office/word/2010/wordprocessingShape" mc:Ignorable="w14 w15 w16se w16cid w16 w16cex wp14">
-  <w:abstractNum w:abstractNumId="0" w15:restartNumberingAfterBreak="0">
-    <w:nsid w:val="41FA6808"/>
-    <w:multiLevelType w:val="multilevel"/>
-    <w:tmpl w:val="96026CBA"/>
+<w:numbering xmlns:w="http://schemas.openxmlformats.org/wordprocessingml/2006/main" xmlns:o="urn:schemas-microsoft-com:office:office" xmlns:r="http://schemas.openxmlformats.org/officeDocument/2006/relationships" xmlns:v="urn:schemas-microsoft-com:vml" xmlns:mc="http://schemas.openxmlformats.org/markup-compatibility/2006" xmlns:w14="http://schemas.microsoft.com/office/word/2010/wordml" mc:Ignorable="w14">
+  <w:abstractNum w:abstractNumId="1">
+    <w:lvl w:ilvl="0">
+      <w:start w:val="1"/>
+      <w:numFmt w:val="decimal"/>
+      <w:lvlText w:val=""/>
+      <w:lvlJc w:val="left"/>
+      <w:pPr>
+        <w:tabs>
+          <w:tab w:val="num" w:pos="0"/>
+        </w:tabs>
+        <w:ind w:left="0" w:hanging="0"/>
+      </w:pPr>
+      <w:rPr>
+        <w:vertAlign w:val="baseline"/>
+        <w:position w:val="0"/>
+        <w:sz w:val="24"/>
+      </w:rPr>
+    </w:lvl>
+    <w:lvl w:ilvl="1">
+      <w:start w:val="1"/>
+      <w:numFmt w:val="decimal"/>
+      <w:lvlText w:val=""/>
+      <w:lvlJc w:val="left"/>
+      <w:pPr>
+        <w:tabs>
+          <w:tab w:val="num" w:pos="0"/>
+        </w:tabs>
+        <w:ind w:left="0" w:hanging="0"/>
+      </w:pPr>
+      <w:rPr>
+        <w:vertAlign w:val="baseline"/>
+        <w:position w:val="0"/>
+        <w:sz w:val="24"/>
+      </w:rPr>
+    </w:lvl>
+    <w:lvl w:ilvl="2">
+      <w:start w:val="1"/>
+      <w:numFmt w:val="decimal"/>
+      <w:lvlText w:val=""/>
+      <w:lvlJc w:val="left"/>
+      <w:pPr>
+        <w:tabs>
+          <w:tab w:val="num" w:pos="0"/>
+        </w:tabs>
+        <w:ind w:left="0" w:hanging="0"/>
+      </w:pPr>
+      <w:rPr>
+        <w:vertAlign w:val="baseline"/>
+        <w:position w:val="0"/>
+        <w:sz w:val="24"/>
+      </w:rPr>
+    </w:lvl>
+    <w:lvl w:ilvl="3">
+      <w:start w:val="1"/>
+      <w:numFmt w:val="decimal"/>
+      <w:lvlText w:val=""/>
+      <w:lvlJc w:val="left"/>
+      <w:pPr>
+        <w:tabs>
+          <w:tab w:val="num" w:pos="0"/>
+        </w:tabs>
+        <w:ind w:left="0" w:hanging="0"/>
+      </w:pPr>
+      <w:rPr>
+        <w:vertAlign w:val="baseline"/>
+        <w:position w:val="0"/>
+        <w:sz w:val="24"/>
+      </w:rPr>
+    </w:lvl>
+    <w:lvl w:ilvl="4">
+      <w:start w:val="1"/>
+      <w:numFmt w:val="decimal"/>
+      <w:lvlText w:val=""/>
+      <w:lvlJc w:val="left"/>
+      <w:pPr>
+        <w:tabs>
+          <w:tab w:val="num" w:pos="0"/>
+        </w:tabs>
+        <w:ind w:left="0" w:hanging="0"/>
+      </w:pPr>
+      <w:rPr>
+        <w:vertAlign w:val="baseline"/>
+        <w:position w:val="0"/>
+        <w:sz w:val="24"/>
+      </w:rPr>
+    </w:lvl>
+    <w:lvl w:ilvl="5">
+      <w:start w:val="1"/>
+      <w:numFmt w:val="decimal"/>
+      <w:lvlText w:val=""/>
+      <w:lvlJc w:val="left"/>
+      <w:pPr>
+        <w:tabs>
+          <w:tab w:val="num" w:pos="0"/>
+        </w:tabs>
+        <w:ind w:left="0" w:hanging="0"/>
+      </w:pPr>
+      <w:rPr>
+        <w:vertAlign w:val="baseline"/>
+        <w:position w:val="0"/>
+        <w:sz w:val="24"/>
+      </w:rPr>
+    </w:lvl>
+    <w:lvl w:ilvl="6">
+      <w:start w:val="1"/>
+      <w:numFmt w:val="decimal"/>
+      <w:lvlText w:val=""/>
+      <w:lvlJc w:val="left"/>
+      <w:pPr>
+        <w:tabs>
+          <w:tab w:val="num" w:pos="0"/>
+        </w:tabs>
+        <w:ind w:left="0" w:hanging="0"/>
+      </w:pPr>
+      <w:rPr>
+        <w:vertAlign w:val="baseline"/>
+        <w:position w:val="0"/>
+        <w:sz w:val="24"/>
+      </w:rPr>
+    </w:lvl>
+    <w:lvl w:ilvl="7">
+      <w:start w:val="1"/>
+      <w:numFmt w:val="decimal"/>
+      <w:lvlText w:val=""/>
+      <w:lvlJc w:val="left"/>
+      <w:pPr>
+        <w:tabs>
+          <w:tab w:val="num" w:pos="0"/>
+        </w:tabs>
+        <w:ind w:left="0" w:hanging="0"/>
+      </w:pPr>
+      <w:rPr>
+        <w:vertAlign w:val="baseline"/>
+        <w:position w:val="0"/>
+        <w:sz w:val="24"/>
+      </w:rPr>
+    </w:lvl>
+    <w:lvl w:ilvl="8">
+      <w:start w:val="1"/>
+      <w:numFmt w:val="decimal"/>
+      <w:lvlText w:val=""/>
+      <w:lvlJc w:val="left"/>
+      <w:pPr>
+        <w:tabs>
+          <w:tab w:val="num" w:pos="0"/>
+        </w:tabs>
+        <w:ind w:left="0" w:hanging="0"/>
+      </w:pPr>
+      <w:rPr>
+        <w:vertAlign w:val="baseline"/>
+        <w:position w:val="0"/>
+        <w:sz w:val="24"/>
+      </w:rPr>
+    </w:lvl>
+  </w:abstractNum>
+  <w:abstractNum w:abstractNumId="2">
     <w:lvl w:ilvl="0">
       <w:start w:val="1"/>
       <w:numFmt w:val="decimal"/>
       <w:lvlText w:val="%1."/>
       <w:lvlJc w:val="left"/>
       <w:pPr>
+        <w:tabs>
+          <w:tab w:val="num" w:pos="0"/>
+        </w:tabs>
         <w:ind w:left="720" w:hanging="360"/>
       </w:pPr>
       <w:rPr>
         <w:vertAlign w:val="baseline"/>
+        <w:position w:val="0"/>
+        <w:sz w:val="24"/>
       </w:rPr>
     </w:lvl>
     <w:lvl w:ilvl="1">
@@ -2368,8 +3227,14 @@
       <w:lvlText w:val=""/>
       <w:lvlJc w:val="left"/>
       <w:pPr>
-        <w:ind w:left="0" w:firstLine="0"/>
+        <w:tabs>
+          <w:tab w:val="num" w:pos="0"/>
+        </w:tabs>
+        <w:ind w:left="0" w:hanging="0"/>
       </w:pPr>
+      <w:rPr>
+        <w:rFonts w:ascii="OpenSymbol" w:hAnsi="OpenSymbol" w:cs="OpenSymbol" w:hint="default"/>
+      </w:rPr>
     </w:lvl>
     <w:lvl w:ilvl="2">
       <w:start w:val="1"/>
@@ -2377,8 +3242,14 @@
       <w:lvlText w:val=""/>
       <w:lvlJc w:val="left"/>
       <w:pPr>
-        <w:ind w:left="0" w:firstLine="0"/>
+        <w:tabs>
+          <w:tab w:val="num" w:pos="0"/>
+        </w:tabs>
+        <w:ind w:left="0" w:hanging="0"/>
       </w:pPr>
+      <w:rPr>
+        <w:rFonts w:ascii="OpenSymbol" w:hAnsi="OpenSymbol" w:cs="OpenSymbol" w:hint="default"/>
+      </w:rPr>
     </w:lvl>
     <w:lvl w:ilvl="3">
       <w:start w:val="1"/>
@@ -2386,8 +3257,14 @@
       <w:lvlText w:val=""/>
       <w:lvlJc w:val="left"/>
       <w:pPr>
-        <w:ind w:left="0" w:firstLine="0"/>
+        <w:tabs>
+          <w:tab w:val="num" w:pos="0"/>
+        </w:tabs>
+        <w:ind w:left="0" w:hanging="0"/>
       </w:pPr>
+      <w:rPr>
+        <w:rFonts w:ascii="OpenSymbol" w:hAnsi="OpenSymbol" w:cs="OpenSymbol" w:hint="default"/>
+      </w:rPr>
     </w:lvl>
     <w:lvl w:ilvl="4">
       <w:start w:val="1"/>
@@ -2395,8 +3272,14 @@
       <w:lvlText w:val=""/>
       <w:lvlJc w:val="left"/>
       <w:pPr>
-        <w:ind w:left="0" w:firstLine="0"/>
+        <w:tabs>
+          <w:tab w:val="num" w:pos="0"/>
+        </w:tabs>
+        <w:ind w:left="0" w:hanging="0"/>
       </w:pPr>
+      <w:rPr>
+        <w:rFonts w:ascii="OpenSymbol" w:hAnsi="OpenSymbol" w:cs="OpenSymbol" w:hint="default"/>
+      </w:rPr>
     </w:lvl>
     <w:lvl w:ilvl="5">
       <w:start w:val="1"/>
@@ -2404,8 +3287,14 @@
       <w:lvlText w:val=""/>
       <w:lvlJc w:val="left"/>
       <w:pPr>
-        <w:ind w:left="0" w:firstLine="0"/>
+        <w:tabs>
+          <w:tab w:val="num" w:pos="0"/>
+        </w:tabs>
+        <w:ind w:left="0" w:hanging="0"/>
       </w:pPr>
+      <w:rPr>
+        <w:rFonts w:ascii="OpenSymbol" w:hAnsi="OpenSymbol" w:cs="OpenSymbol" w:hint="default"/>
+      </w:rPr>
     </w:lvl>
     <w:lvl w:ilvl="6">
       <w:start w:val="1"/>
@@ -2413,8 +3302,14 @@
       <w:lvlText w:val=""/>
       <w:lvlJc w:val="left"/>
       <w:pPr>
-        <w:ind w:left="0" w:firstLine="0"/>
+        <w:tabs>
+          <w:tab w:val="num" w:pos="0"/>
+        </w:tabs>
+        <w:ind w:left="0" w:hanging="0"/>
       </w:pPr>
+      <w:rPr>
+        <w:rFonts w:ascii="OpenSymbol" w:hAnsi="OpenSymbol" w:cs="OpenSymbol" w:hint="default"/>
+      </w:rPr>
     </w:lvl>
     <w:lvl w:ilvl="7">
       <w:start w:val="1"/>
@@ -2422,8 +3317,14 @@
       <w:lvlText w:val=""/>
       <w:lvlJc w:val="left"/>
       <w:pPr>
-        <w:ind w:left="0" w:firstLine="0"/>
+        <w:tabs>
+          <w:tab w:val="num" w:pos="0"/>
+        </w:tabs>
+        <w:ind w:left="0" w:hanging="0"/>
       </w:pPr>
+      <w:rPr>
+        <w:rFonts w:ascii="OpenSymbol" w:hAnsi="OpenSymbol" w:cs="OpenSymbol" w:hint="default"/>
+      </w:rPr>
     </w:lvl>
     <w:lvl w:ilvl="8">
       <w:start w:val="1"/>
@@ -2431,156 +3332,175 @@
       <w:lvlText w:val=""/>
       <w:lvlJc w:val="left"/>
       <w:pPr>
-        <w:ind w:left="0" w:firstLine="0"/>
+        <w:tabs>
+          <w:tab w:val="num" w:pos="0"/>
+        </w:tabs>
+        <w:ind w:left="0" w:hanging="0"/>
       </w:pPr>
+      <w:rPr>
+        <w:rFonts w:ascii="OpenSymbol" w:hAnsi="OpenSymbol" w:cs="OpenSymbol" w:hint="default"/>
+      </w:rPr>
     </w:lvl>
   </w:abstractNum>
-  <w:abstractNum w:abstractNumId="1" w15:restartNumberingAfterBreak="0">
-    <w:nsid w:val="657A4B49"/>
-    <w:multiLevelType w:val="multilevel"/>
-    <w:tmpl w:val="FAEE01A6"/>
+  <w:abstractNum w:abstractNumId="3">
     <w:lvl w:ilvl="0">
       <w:start w:val="1"/>
-      <w:numFmt w:val="decimal"/>
+      <w:numFmt w:val="none"/>
+      <w:suff w:val="nothing"/>
       <w:lvlText w:val=""/>
       <w:lvlJc w:val="left"/>
       <w:pPr>
-        <w:ind w:left="0" w:firstLine="0"/>
+        <w:tabs>
+          <w:tab w:val="num" w:pos="0"/>
+        </w:tabs>
+        <w:ind w:left="0" w:hanging="0"/>
       </w:pPr>
-      <w:rPr>
-        <w:vertAlign w:val="baseline"/>
-      </w:rPr>
     </w:lvl>
     <w:lvl w:ilvl="1">
       <w:start w:val="1"/>
-      <w:numFmt w:val="decimal"/>
+      <w:numFmt w:val="none"/>
+      <w:suff w:val="nothing"/>
       <w:lvlText w:val=""/>
       <w:lvlJc w:val="left"/>
       <w:pPr>
-        <w:ind w:left="0" w:firstLine="0"/>
+        <w:tabs>
+          <w:tab w:val="num" w:pos="0"/>
+        </w:tabs>
+        <w:ind w:left="0" w:hanging="0"/>
       </w:pPr>
-      <w:rPr>
-        <w:vertAlign w:val="baseline"/>
-      </w:rPr>
     </w:lvl>
     <w:lvl w:ilvl="2">
       <w:start w:val="1"/>
-      <w:numFmt w:val="decimal"/>
+      <w:numFmt w:val="none"/>
+      <w:suff w:val="nothing"/>
       <w:lvlText w:val=""/>
       <w:lvlJc w:val="left"/>
       <w:pPr>
-        <w:ind w:left="0" w:firstLine="0"/>
+        <w:tabs>
+          <w:tab w:val="num" w:pos="0"/>
+        </w:tabs>
+        <w:ind w:left="0" w:hanging="0"/>
       </w:pPr>
-      <w:rPr>
-        <w:vertAlign w:val="baseline"/>
-      </w:rPr>
     </w:lvl>
     <w:lvl w:ilvl="3">
       <w:start w:val="1"/>
-      <w:numFmt w:val="decimal"/>
+      <w:numFmt w:val="none"/>
+      <w:suff w:val="nothing"/>
       <w:lvlText w:val=""/>
       <w:lvlJc w:val="left"/>
       <w:pPr>
-        <w:ind w:left="0" w:firstLine="0"/>
+        <w:tabs>
+          <w:tab w:val="num" w:pos="0"/>
+        </w:tabs>
+        <w:ind w:left="0" w:hanging="0"/>
       </w:pPr>
-      <w:rPr>
-        <w:vertAlign w:val="baseline"/>
-      </w:rPr>
     </w:lvl>
     <w:lvl w:ilvl="4">
       <w:start w:val="1"/>
-      <w:numFmt w:val="decimal"/>
+      <w:numFmt w:val="none"/>
+      <w:suff w:val="nothing"/>
       <w:lvlText w:val=""/>
       <w:lvlJc w:val="left"/>
       <w:pPr>
-        <w:ind w:left="0" w:firstLine="0"/>
+        <w:tabs>
+          <w:tab w:val="num" w:pos="0"/>
+        </w:tabs>
+        <w:ind w:left="0" w:hanging="0"/>
       </w:pPr>
-      <w:rPr>
-        <w:vertAlign w:val="baseline"/>
-      </w:rPr>
     </w:lvl>
     <w:lvl w:ilvl="5">
       <w:start w:val="1"/>
-      <w:numFmt w:val="decimal"/>
+      <w:numFmt w:val="none"/>
+      <w:suff w:val="nothing"/>
       <w:lvlText w:val=""/>
       <w:lvlJc w:val="left"/>
       <w:pPr>
-        <w:ind w:left="0" w:firstLine="0"/>
+        <w:tabs>
+          <w:tab w:val="num" w:pos="0"/>
+        </w:tabs>
+        <w:ind w:left="0" w:hanging="0"/>
       </w:pPr>
-      <w:rPr>
-        <w:vertAlign w:val="baseline"/>
-      </w:rPr>
     </w:lvl>
     <w:lvl w:ilvl="6">
       <w:start w:val="1"/>
-      <w:numFmt w:val="decimal"/>
+      <w:numFmt w:val="none"/>
+      <w:suff w:val="nothing"/>
       <w:lvlText w:val=""/>
       <w:lvlJc w:val="left"/>
       <w:pPr>
-        <w:ind w:left="0" w:firstLine="0"/>
+        <w:tabs>
+          <w:tab w:val="num" w:pos="0"/>
+        </w:tabs>
+        <w:ind w:left="0" w:hanging="0"/>
       </w:pPr>
-      <w:rPr>
-        <w:vertAlign w:val="baseline"/>
-      </w:rPr>
     </w:lvl>
     <w:lvl w:ilvl="7">
       <w:start w:val="1"/>
-      <w:numFmt w:val="decimal"/>
+      <w:numFmt w:val="none"/>
+      <w:suff w:val="nothing"/>
       <w:lvlText w:val=""/>
       <w:lvlJc w:val="left"/>
       <w:pPr>
-        <w:ind w:left="0" w:firstLine="0"/>
+        <w:tabs>
+          <w:tab w:val="num" w:pos="0"/>
+        </w:tabs>
+        <w:ind w:left="0" w:hanging="0"/>
       </w:pPr>
-      <w:rPr>
-        <w:vertAlign w:val="baseline"/>
-      </w:rPr>
     </w:lvl>
     <w:lvl w:ilvl="8">
       <w:start w:val="1"/>
-      <w:numFmt w:val="decimal"/>
+      <w:numFmt w:val="none"/>
+      <w:suff w:val="nothing"/>
       <w:lvlText w:val=""/>
       <w:lvlJc w:val="left"/>
       <w:pPr>
-        <w:ind w:left="0" w:firstLine="0"/>
+        <w:tabs>
+          <w:tab w:val="num" w:pos="0"/>
+        </w:tabs>
+        <w:ind w:left="0" w:hanging="0"/>
       </w:pPr>
-      <w:rPr>
-        <w:vertAlign w:val="baseline"/>
-      </w:rPr>
     </w:lvl>
   </w:abstractNum>
   <w:num w:numId="1">
     <w:abstractNumId w:val="1"/>
   </w:num>
   <w:num w:numId="2">
-    <w:abstractNumId w:val="0"/>
+    <w:abstractNumId w:val="2"/>
+  </w:num>
+  <w:num w:numId="3">
+    <w:abstractNumId w:val="3"/>
   </w:num>
 </w:numbering>
 </file>
 
 <file path=word/styles.xml><?xml version="1.0" encoding="utf-8"?>
-<w:styles xmlns:mc="http://schemas.openxmlformats.org/markup-compatibility/2006" xmlns:r="http://schemas.openxmlformats.org/officeDocument/2006/relationships" xmlns:w="http://schemas.openxmlformats.org/wordprocessingml/2006/main" xmlns:w14="http://schemas.microsoft.com/office/word/2010/wordml" xmlns:w15="http://schemas.microsoft.com/office/word/2012/wordml" xmlns:w16cex="http://schemas.microsoft.com/office/word/2018/wordml/cex" xmlns:w16cid="http://schemas.microsoft.com/office/word/2016/wordml/cid" xmlns:w16="http://schemas.microsoft.com/office/word/2018/wordml" xmlns:w16se="http://schemas.microsoft.com/office/word/2015/wordml/symex" mc:Ignorable="w14 w15 w16se w16cid w16 w16cex">
+<w:styles xmlns:w="http://schemas.openxmlformats.org/wordprocessingml/2006/main" xmlns:w14="http://schemas.microsoft.com/office/word/2010/wordml" xmlns:mc="http://schemas.openxmlformats.org/markup-compatibility/2006" mc:Ignorable="w14">
   <w:docDefaults>
     <w:rPrDefault>
       <w:rPr>
-        <w:rFonts w:ascii="Times New Roman" w:eastAsia="Times New Roman" w:hAnsi="Times New Roman" w:cs="Times New Roman"/>
+        <w:rFonts w:ascii="Times New Roman" w:hAnsi="Times New Roman" w:eastAsia="Times New Roman" w:cs="Times New Roman"/>
         <w:sz w:val="24"/>
         <w:szCs w:val="24"/>
         <w:lang w:val="pt-BR" w:eastAsia="pt-BR" w:bidi="ar-SA"/>
       </w:rPr>
     </w:rPrDefault>
-    <w:pPrDefault/>
+    <w:pPrDefault>
+      <w:pPr>
+        <w:suppressAutoHyphens w:val="true"/>
+      </w:pPr>
+    </w:pPrDefault>
   </w:docDefaults>
   <w:latentStyles w:defLockedState="0" w:defUIPriority="99" w:defSemiHidden="0" w:defUnhideWhenUsed="0" w:defQFormat="0" w:count="376">
     <w:lsdException w:name="Normal" w:uiPriority="0" w:qFormat="1"/>
     <w:lsdException w:name="heading 1" w:uiPriority="9" w:qFormat="1"/>
-    <w:lsdException w:name="heading 2" w:semiHidden="1" w:uiPriority="9" w:unhideWhenUsed="1" w:qFormat="1"/>
-    <w:lsdException w:name="heading 3" w:semiHidden="1" w:uiPriority="9" w:unhideWhenUsed="1" w:qFormat="1"/>
-    <w:lsdException w:name="heading 4" w:semiHidden="1" w:uiPriority="9" w:unhideWhenUsed="1" w:qFormat="1"/>
-    <w:lsdException w:name="heading 5" w:semiHidden="1" w:uiPriority="9" w:unhideWhenUsed="1" w:qFormat="1"/>
-    <w:lsdException w:name="heading 6" w:semiHidden="1" w:uiPriority="9" w:unhideWhenUsed="1" w:qFormat="1"/>
-    <w:lsdException w:name="heading 7" w:semiHidden="1" w:uiPriority="9" w:unhideWhenUsed="1" w:qFormat="1"/>
-    <w:lsdException w:name="heading 8" w:semiHidden="1" w:uiPriority="9" w:unhideWhenUsed="1" w:qFormat="1"/>
-    <w:lsdException w:name="heading 9" w:semiHidden="1" w:uiPriority="9" w:unhideWhenUsed="1" w:qFormat="1"/>
+    <w:lsdException w:name="heading 2" w:uiPriority="9" w:semiHidden="1" w:unhideWhenUsed="1" w:qFormat="1"/>
+    <w:lsdException w:name="heading 3" w:uiPriority="9" w:semiHidden="1" w:unhideWhenUsed="1" w:qFormat="1"/>
+    <w:lsdException w:name="heading 4" w:uiPriority="9" w:semiHidden="1" w:unhideWhenUsed="1" w:qFormat="1"/>
+    <w:lsdException w:name="heading 5" w:uiPriority="9" w:semiHidden="1" w:unhideWhenUsed="1" w:qFormat="1"/>
+    <w:lsdException w:name="heading 6" w:uiPriority="9" w:semiHidden="1" w:unhideWhenUsed="1" w:qFormat="1"/>
+    <w:lsdException w:name="heading 7" w:uiPriority="9" w:semiHidden="1" w:unhideWhenUsed="1" w:qFormat="1"/>
+    <w:lsdException w:name="heading 8" w:uiPriority="9" w:semiHidden="1" w:unhideWhenUsed="1" w:qFormat="1"/>
+    <w:lsdException w:name="heading 9" w:uiPriority="9" w:semiHidden="1" w:unhideWhenUsed="1" w:qFormat="1"/>
     <w:lsdException w:name="index 1" w:semiHidden="1" w:unhideWhenUsed="1"/>
     <w:lsdException w:name="index 2" w:semiHidden="1" w:unhideWhenUsed="1"/>
     <w:lsdException w:name="index 3" w:semiHidden="1" w:unhideWhenUsed="1"/>
@@ -2590,22 +3510,22 @@
     <w:lsdException w:name="index 7" w:semiHidden="1" w:unhideWhenUsed="1"/>
     <w:lsdException w:name="index 8" w:semiHidden="1" w:unhideWhenUsed="1"/>
     <w:lsdException w:name="index 9" w:semiHidden="1" w:unhideWhenUsed="1"/>
-    <w:lsdException w:name="toc 1" w:semiHidden="1" w:uiPriority="39" w:unhideWhenUsed="1"/>
-    <w:lsdException w:name="toc 2" w:semiHidden="1" w:uiPriority="39" w:unhideWhenUsed="1"/>
-    <w:lsdException w:name="toc 3" w:semiHidden="1" w:uiPriority="39" w:unhideWhenUsed="1"/>
-    <w:lsdException w:name="toc 4" w:semiHidden="1" w:uiPriority="39" w:unhideWhenUsed="1"/>
-    <w:lsdException w:name="toc 5" w:semiHidden="1" w:uiPriority="39" w:unhideWhenUsed="1"/>
-    <w:lsdException w:name="toc 6" w:semiHidden="1" w:uiPriority="39" w:unhideWhenUsed="1"/>
-    <w:lsdException w:name="toc 7" w:semiHidden="1" w:uiPriority="39" w:unhideWhenUsed="1"/>
-    <w:lsdException w:name="toc 8" w:semiHidden="1" w:uiPriority="39" w:unhideWhenUsed="1"/>
-    <w:lsdException w:name="toc 9" w:semiHidden="1" w:uiPriority="39" w:unhideWhenUsed="1"/>
+    <w:lsdException w:name="toc 1" w:uiPriority="39" w:semiHidden="1" w:unhideWhenUsed="1"/>
+    <w:lsdException w:name="toc 2" w:uiPriority="39" w:semiHidden="1" w:unhideWhenUsed="1"/>
+    <w:lsdException w:name="toc 3" w:uiPriority="39" w:semiHidden="1" w:unhideWhenUsed="1"/>
+    <w:lsdException w:name="toc 4" w:uiPriority="39" w:semiHidden="1" w:unhideWhenUsed="1"/>
+    <w:lsdException w:name="toc 5" w:uiPriority="39" w:semiHidden="1" w:unhideWhenUsed="1"/>
+    <w:lsdException w:name="toc 6" w:uiPriority="39" w:semiHidden="1" w:unhideWhenUsed="1"/>
+    <w:lsdException w:name="toc 7" w:uiPriority="39" w:semiHidden="1" w:unhideWhenUsed="1"/>
+    <w:lsdException w:name="toc 8" w:uiPriority="39" w:semiHidden="1" w:unhideWhenUsed="1"/>
+    <w:lsdException w:name="toc 9" w:uiPriority="39" w:semiHidden="1" w:unhideWhenUsed="1"/>
     <w:lsdException w:name="Normal Indent" w:semiHidden="1" w:unhideWhenUsed="1"/>
     <w:lsdException w:name="footnote text" w:semiHidden="1" w:unhideWhenUsed="1"/>
     <w:lsdException w:name="annotation text" w:semiHidden="1" w:unhideWhenUsed="1"/>
     <w:lsdException w:name="header" w:semiHidden="1" w:unhideWhenUsed="1"/>
     <w:lsdException w:name="footer" w:semiHidden="1" w:unhideWhenUsed="1"/>
     <w:lsdException w:name="index heading" w:semiHidden="1" w:unhideWhenUsed="1"/>
-    <w:lsdException w:name="caption" w:semiHidden="1" w:uiPriority="35" w:unhideWhenUsed="1" w:qFormat="1"/>
+    <w:lsdException w:name="caption" w:uiPriority="35" w:semiHidden="1" w:unhideWhenUsed="1" w:qFormat="1"/>
     <w:lsdException w:name="table of figures" w:semiHidden="1" w:unhideWhenUsed="1"/>
     <w:lsdException w:name="envelope address" w:semiHidden="1" w:unhideWhenUsed="1"/>
     <w:lsdException w:name="envelope return" w:semiHidden="1" w:unhideWhenUsed="1"/>
@@ -2636,7 +3556,7 @@
     <w:lsdException w:name="Title" w:uiPriority="10" w:qFormat="1"/>
     <w:lsdException w:name="Closing" w:semiHidden="1" w:unhideWhenUsed="1"/>
     <w:lsdException w:name="Signature" w:semiHidden="1" w:unhideWhenUsed="1"/>
-    <w:lsdException w:name="Default Paragraph Font" w:semiHidden="1" w:uiPriority="1" w:unhideWhenUsed="1"/>
+    <w:lsdException w:name="Default Paragraph Font" w:uiPriority="1" w:semiHidden="1" w:unhideWhenUsed="1"/>
     <w:lsdException w:name="Body Text" w:semiHidden="1" w:unhideWhenUsed="1"/>
     <w:lsdException w:name="Body Text Indent" w:semiHidden="1" w:unhideWhenUsed="1"/>
     <w:lsdException w:name="List Continue" w:semiHidden="1" w:unhideWhenUsed="1"/>
@@ -2836,8 +3756,8 @@
     <w:lsdException w:name="Subtle Reference" w:uiPriority="31" w:qFormat="1"/>
     <w:lsdException w:name="Intense Reference" w:uiPriority="32" w:qFormat="1"/>
     <w:lsdException w:name="Book Title" w:uiPriority="33" w:qFormat="1"/>
-    <w:lsdException w:name="Bibliography" w:semiHidden="1" w:uiPriority="37" w:unhideWhenUsed="1"/>
-    <w:lsdException w:name="TOC Heading" w:semiHidden="1" w:uiPriority="39" w:unhideWhenUsed="1" w:qFormat="1"/>
+    <w:lsdException w:name="Bibliography" w:uiPriority="37" w:semiHidden="1" w:unhideWhenUsed="1"/>
+    <w:lsdException w:name="TOC Heading" w:uiPriority="39" w:semiHidden="1" w:unhideWhenUsed="1" w:qFormat="1"/>
     <w:lsdException w:name="Plain Table 1" w:uiPriority="41"/>
     <w:lsdException w:name="Plain Table 2" w:uiPriority="42"/>
     <w:lsdException w:name="Plain Table 3" w:uiPriority="43"/>
@@ -2948,19 +3868,33 @@
     <w:lsdException w:name="Unresolved Mention" w:semiHidden="1" w:unhideWhenUsed="1"/>
     <w:lsdException w:name="Smart Link" w:semiHidden="1" w:unhideWhenUsed="1"/>
   </w:latentStyles>
-  <w:style w:type="paragraph" w:default="1" w:styleId="Normal">
+  <w:style w:type="paragraph" w:styleId="Normal" w:default="1">
     <w:name w:val="Normal"/>
     <w:qFormat/>
-    <w:rsid w:val="0048125A"/>
+    <w:rsid w:val="0048125a"/>
+    <w:pPr>
+      <w:widowControl/>
+      <w:bidi w:val="0"/>
+      <w:spacing w:before="0" w:after="0"/>
+      <w:jc w:val="left"/>
+    </w:pPr>
+    <w:rPr>
+      <w:rFonts w:ascii="Times New Roman" w:hAnsi="Times New Roman" w:eastAsia="Times New Roman" w:cs="Times New Roman"/>
+      <w:color w:val="auto"/>
+      <w:kern w:val="0"/>
+      <w:sz w:val="24"/>
+      <w:szCs w:val="24"/>
+      <w:lang w:val="pt-BR" w:eastAsia="pt-BR" w:bidi="ar-SA"/>
+    </w:rPr>
   </w:style>
-  <w:style w:type="paragraph" w:styleId="Ttulo1">
-    <w:name w:val="heading 1"/>
+  <w:style w:type="paragraph" w:styleId="Heading1">
+    <w:name w:val="Heading 1"/>
     <w:basedOn w:val="Normal"/>
     <w:next w:val="Normal"/>
     <w:uiPriority w:val="9"/>
     <w:qFormat/>
     <w:pPr>
-      <w:keepNext/>
+      <w:keepNext w:val="true"/>
       <w:outlineLvl w:val="0"/>
     </w:pPr>
     <w:rPr>
@@ -2969,15 +3903,15 @@
       <w:szCs w:val="28"/>
     </w:rPr>
   </w:style>
-  <w:style w:type="paragraph" w:styleId="Ttulo2">
-    <w:name w:val="heading 2"/>
+  <w:style w:type="paragraph" w:styleId="Heading2">
+    <w:name w:val="Heading 2"/>
     <w:basedOn w:val="Normal"/>
     <w:next w:val="Normal"/>
     <w:uiPriority w:val="9"/>
     <w:unhideWhenUsed/>
     <w:qFormat/>
     <w:pPr>
-      <w:keepNext/>
+      <w:keepNext w:val="true"/>
       <w:jc w:val="center"/>
       <w:outlineLvl w:val="1"/>
     </w:pPr>
@@ -2986,8 +3920,8 @@
       <w:szCs w:val="28"/>
     </w:rPr>
   </w:style>
-  <w:style w:type="paragraph" w:styleId="Ttulo3">
-    <w:name w:val="heading 3"/>
+  <w:style w:type="paragraph" w:styleId="Heading3">
+    <w:name w:val="Heading 3"/>
     <w:basedOn w:val="Normal"/>
     <w:next w:val="Normal"/>
     <w:uiPriority w:val="9"/>
@@ -2995,7 +3929,7 @@
     <w:unhideWhenUsed/>
     <w:qFormat/>
     <w:pPr>
-      <w:keepNext/>
+      <w:keepNext w:val="true"/>
       <w:keepLines/>
       <w:spacing w:before="280" w:after="80"/>
       <w:outlineLvl w:val="2"/>
@@ -3006,8 +3940,8 @@
       <w:szCs w:val="28"/>
     </w:rPr>
   </w:style>
-  <w:style w:type="paragraph" w:styleId="Ttulo4">
-    <w:name w:val="heading 4"/>
+  <w:style w:type="paragraph" w:styleId="Heading4">
+    <w:name w:val="Heading 4"/>
     <w:basedOn w:val="Normal"/>
     <w:next w:val="Normal"/>
     <w:uiPriority w:val="9"/>
@@ -3015,7 +3949,7 @@
     <w:unhideWhenUsed/>
     <w:qFormat/>
     <w:pPr>
-      <w:keepNext/>
+      <w:keepNext w:val="true"/>
       <w:keepLines/>
       <w:spacing w:before="240" w:after="40"/>
       <w:outlineLvl w:val="3"/>
@@ -3024,8 +3958,8 @@
       <w:b/>
     </w:rPr>
   </w:style>
-  <w:style w:type="paragraph" w:styleId="Ttulo5">
-    <w:name w:val="heading 5"/>
+  <w:style w:type="paragraph" w:styleId="Heading5">
+    <w:name w:val="Heading 5"/>
     <w:basedOn w:val="Normal"/>
     <w:next w:val="Normal"/>
     <w:uiPriority w:val="9"/>
@@ -3033,7 +3967,7 @@
     <w:unhideWhenUsed/>
     <w:qFormat/>
     <w:pPr>
-      <w:keepNext/>
+      <w:keepNext w:val="true"/>
       <w:keepLines/>
       <w:spacing w:before="220" w:after="40"/>
       <w:outlineLvl w:val="4"/>
@@ -3044,8 +3978,8 @@
       <w:szCs w:val="22"/>
     </w:rPr>
   </w:style>
-  <w:style w:type="paragraph" w:styleId="Ttulo6">
-    <w:name w:val="heading 6"/>
+  <w:style w:type="paragraph" w:styleId="Heading6">
+    <w:name w:val="Heading 6"/>
     <w:basedOn w:val="Normal"/>
     <w:next w:val="Normal"/>
     <w:uiPriority w:val="9"/>
@@ -3053,7 +3987,7 @@
     <w:unhideWhenUsed/>
     <w:qFormat/>
     <w:pPr>
-      <w:keepNext/>
+      <w:keepNext w:val="true"/>
       <w:keepLines/>
       <w:spacing w:before="200" w:after="40"/>
       <w:outlineLvl w:val="5"/>
@@ -3064,11 +3998,234 @@
       <w:szCs w:val="20"/>
     </w:rPr>
   </w:style>
-  <w:style w:type="character" w:default="1" w:styleId="Fontepargpadro">
+  <w:style w:type="character" w:styleId="DefaultParagraphFont" w:default="1">
     <w:name w:val="Default Paragraph Font"/>
     <w:uiPriority w:val="1"/>
     <w:semiHidden/>
     <w:unhideWhenUsed/>
+    <w:qFormat/>
+    <w:rPr/>
+  </w:style>
+  <w:style w:type="character" w:styleId="WW8Num1z0" w:customStyle="1">
+    <w:name w:val="WW8Num1z0"/>
+    <w:qFormat/>
+    <w:rPr>
+      <w:rFonts w:ascii="Symbol" w:hAnsi="Symbol" w:cs="Symbol"/>
+      <w:w w:val="100"/>
+      <w:position w:val="0"/>
+      <w:sz w:val="24"/>
+      <w:effect w:val="none"/>
+      <w:vertAlign w:val="baseline"/>
+      <w:em w:val="none"/>
+    </w:rPr>
+  </w:style>
+  <w:style w:type="character" w:styleId="Smbolosdenumerao">
+    <w:name w:val="Símbolos de numeração"/>
+    <w:qFormat/>
+    <w:rPr/>
+  </w:style>
+  <w:style w:type="paragraph" w:styleId="Ttulo">
+    <w:name w:val="Título"/>
+    <w:basedOn w:val="Normal"/>
+    <w:next w:val="BodyText"/>
+    <w:qFormat/>
+    <w:pPr>
+      <w:keepNext w:val="true"/>
+      <w:spacing w:before="240" w:after="120"/>
+    </w:pPr>
+    <w:rPr>
+      <w:rFonts w:ascii="Liberation Sans" w:hAnsi="Liberation Sans" w:eastAsia="Noto Sans CJK SC" w:cs="FreeSans"/>
+      <w:sz w:val="28"/>
+      <w:szCs w:val="28"/>
+    </w:rPr>
+  </w:style>
+  <w:style w:type="paragraph" w:styleId="BodyText">
+    <w:name w:val="Body Text"/>
+    <w:basedOn w:val="Normal"/>
+    <w:pPr>
+      <w:spacing w:lineRule="auto" w:line="276" w:before="0" w:after="140"/>
+      <w:ind w:hanging="1" w:left="-1"/>
+      <w:textAlignment w:val="top"/>
+      <w:outlineLvl w:val="0"/>
+    </w:pPr>
+    <w:rPr>
+      <w:vertAlign w:val="subscript"/>
+      <w:lang w:eastAsia="zh-CN"/>
+    </w:rPr>
+  </w:style>
+  <w:style w:type="paragraph" w:styleId="List">
+    <w:name w:val="List"/>
+    <w:basedOn w:val="BodyText"/>
+    <w:pPr/>
+    <w:rPr>
+      <w:rFonts w:cs="Noto Sans Devanagari"/>
+    </w:rPr>
+  </w:style>
+  <w:style w:type="paragraph" w:styleId="Caption">
+    <w:name w:val="Caption"/>
+    <w:basedOn w:val="Normal"/>
+    <w:qFormat/>
+    <w:pPr>
+      <w:suppressLineNumbers/>
+      <w:spacing w:lineRule="atLeast" w:line="1" w:before="120" w:after="120"/>
+      <w:ind w:hanging="1" w:left="-1"/>
+      <w:textAlignment w:val="top"/>
+      <w:outlineLvl w:val="0"/>
+    </w:pPr>
+    <w:rPr>
+      <w:rFonts w:cs="Noto Sans Devanagari"/>
+      <w:i/>
+      <w:iCs/>
+      <w:position w:val="-1"/>
+      <w:lang w:eastAsia="zh-CN"/>
+    </w:rPr>
+  </w:style>
+  <w:style w:type="paragraph" w:styleId="ndice" w:customStyle="1">
+    <w:name w:val="Índice"/>
+    <w:basedOn w:val="Normal"/>
+    <w:qFormat/>
+    <w:pPr>
+      <w:suppressLineNumbers/>
+      <w:spacing w:lineRule="atLeast" w:line="1"/>
+      <w:ind w:hanging="1" w:left="-1"/>
+      <w:textAlignment w:val="top"/>
+      <w:outlineLvl w:val="0"/>
+    </w:pPr>
+    <w:rPr>
+      <w:rFonts w:cs="Noto Sans Devanagari"/>
+      <w:position w:val="-1"/>
+      <w:lang w:eastAsia="zh-CN"/>
+    </w:rPr>
+  </w:style>
+  <w:style w:type="paragraph" w:styleId="Title">
+    <w:name w:val="Title"/>
+    <w:basedOn w:val="Normal"/>
+    <w:next w:val="BodyText"/>
+    <w:uiPriority w:val="10"/>
+    <w:qFormat/>
+    <w:pPr>
+      <w:spacing w:lineRule="atLeast" w:line="1"/>
+      <w:ind w:hanging="1" w:left="-1"/>
+      <w:jc w:val="center"/>
+      <w:textAlignment w:val="top"/>
+      <w:outlineLvl w:val="0"/>
+    </w:pPr>
+    <w:rPr>
+      <w:b/>
+      <w:position w:val="-1"/>
+      <w:sz w:val="32"/>
+      <w:szCs w:val="20"/>
+      <w:lang w:eastAsia="zh-CN"/>
+    </w:rPr>
+  </w:style>
+  <w:style w:type="paragraph" w:styleId="Caption1" w:customStyle="1">
+    <w:name w:val="Caption1"/>
+    <w:basedOn w:val="Normal"/>
+    <w:qFormat/>
+    <w:pPr>
+      <w:suppressLineNumbers/>
+      <w:spacing w:lineRule="atLeast" w:line="1" w:before="120" w:after="120"/>
+      <w:ind w:hanging="1" w:left="-1"/>
+      <w:textAlignment w:val="top"/>
+      <w:outlineLvl w:val="0"/>
+    </w:pPr>
+    <w:rPr>
+      <w:rFonts w:cs="Noto Sans Devanagari"/>
+      <w:i/>
+      <w:iCs/>
+      <w:position w:val="-1"/>
+      <w:lang w:eastAsia="zh-CN"/>
+    </w:rPr>
+  </w:style>
+  <w:style w:type="paragraph" w:styleId="Caption11" w:customStyle="1">
+    <w:name w:val="Caption11"/>
+    <w:basedOn w:val="Normal"/>
+    <w:qFormat/>
+    <w:pPr>
+      <w:suppressLineNumbers/>
+      <w:spacing w:lineRule="atLeast" w:line="1" w:before="120" w:after="120"/>
+      <w:ind w:hanging="1" w:left="-1"/>
+      <w:textAlignment w:val="top"/>
+      <w:outlineLvl w:val="0"/>
+    </w:pPr>
+    <w:rPr>
+      <w:rFonts w:cs="Noto Sans Devanagari"/>
+      <w:i/>
+      <w:iCs/>
+      <w:position w:val="-1"/>
+      <w:lang w:eastAsia="zh-CN"/>
+    </w:rPr>
+  </w:style>
+  <w:style w:type="paragraph" w:styleId="BodyTextIndent">
+    <w:name w:val="Body Text Indent"/>
+    <w:basedOn w:val="Normal"/>
+    <w:pPr>
+      <w:spacing w:lineRule="atLeast" w:line="1"/>
+      <w:ind w:hanging="1" w:left="284"/>
+      <w:textAlignment w:val="top"/>
+      <w:outlineLvl w:val="0"/>
+    </w:pPr>
+    <w:rPr>
+      <w:position w:val="-1"/>
+      <w:sz w:val="28"/>
+      <w:szCs w:val="20"/>
+      <w:lang w:eastAsia="zh-CN"/>
+    </w:rPr>
+  </w:style>
+  <w:style w:type="paragraph" w:styleId="Contedodatabela" w:customStyle="1">
+    <w:name w:val="Conteúdo da tabela"/>
+    <w:basedOn w:val="Normal"/>
+    <w:qFormat/>
+    <w:pPr>
+      <w:widowControl w:val="false"/>
+      <w:suppressLineNumbers/>
+      <w:spacing w:lineRule="atLeast" w:line="1"/>
+      <w:ind w:hanging="1" w:left="-1"/>
+      <w:textAlignment w:val="top"/>
+      <w:outlineLvl w:val="0"/>
+    </w:pPr>
+    <w:rPr>
+      <w:position w:val="-1"/>
+      <w:lang w:eastAsia="zh-CN"/>
+    </w:rPr>
+  </w:style>
+  <w:style w:type="paragraph" w:styleId="Ttulodetabela" w:customStyle="1">
+    <w:name w:val="Título de tabela"/>
+    <w:basedOn w:val="Contedodatabela"/>
+    <w:qFormat/>
+    <w:pPr>
+      <w:jc w:val="center"/>
+    </w:pPr>
+    <w:rPr>
+      <w:b/>
+      <w:bCs/>
+    </w:rPr>
+  </w:style>
+  <w:style w:type="paragraph" w:styleId="Subtitle">
+    <w:name w:val="Subtitle"/>
+    <w:basedOn w:val="Normal"/>
+    <w:next w:val="Normal"/>
+    <w:uiPriority w:val="11"/>
+    <w:qFormat/>
+    <w:pPr>
+      <w:keepNext w:val="true"/>
+      <w:keepLines/>
+      <w:spacing w:before="360" w:after="80"/>
+    </w:pPr>
+    <w:rPr>
+      <w:rFonts w:ascii="Georgia" w:hAnsi="Georgia" w:eastAsia="Georgia" w:cs="Georgia"/>
+      <w:i/>
+      <w:color w:val="666666"/>
+      <w:sz w:val="48"/>
+      <w:szCs w:val="48"/>
+    </w:rPr>
+  </w:style>
+  <w:style w:type="numbering" w:styleId="Semlista" w:default="1">
+    <w:name w:val="Sem lista"/>
+    <w:uiPriority w:val="99"/>
+    <w:semiHidden/>
+    <w:unhideWhenUsed/>
+    <w:qFormat/>
   </w:style>
   <w:style w:type="table" w:default="1" w:styleId="Tabelanormal">
     <w:name w:val="Normal Table"/>
@@ -3076,7 +4233,6 @@
     <w:semiHidden/>
     <w:unhideWhenUsed/>
     <w:tblPr>
-      <w:tblInd w:w="0" w:type="dxa"/>
       <w:tblCellMar>
         <w:top w:w="0" w:type="dxa"/>
         <w:left w:w="108" w:type="dxa"/>
@@ -3084,12 +4240,6 @@
         <w:right w:w="108" w:type="dxa"/>
       </w:tblCellMar>
     </w:tblPr>
-  </w:style>
-  <w:style w:type="numbering" w:default="1" w:styleId="Semlista">
-    <w:name w:val="No List"/>
-    <w:uiPriority w:val="99"/>
-    <w:semiHidden/>
-    <w:unhideWhenUsed/>
   </w:style>
   <w:style w:type="table" w:customStyle="1" w:styleId="TableNormal">
     <w:name w:val="TableNormal"/>
@@ -3102,294 +4252,45 @@
       </w:tblCellMar>
     </w:tblPr>
   </w:style>
-  <w:style w:type="paragraph" w:styleId="Ttulo">
-    <w:name w:val="Title"/>
-    <w:basedOn w:val="Normal"/>
-    <w:next w:val="Corpodetexto"/>
-    <w:uiPriority w:val="10"/>
-    <w:qFormat/>
-    <w:pPr>
-      <w:spacing w:line="1" w:lineRule="atLeast"/>
-      <w:ind w:leftChars="-1" w:left="-1" w:hangingChars="1" w:hanging="1"/>
-      <w:jc w:val="center"/>
-      <w:textDirection w:val="btLr"/>
-      <w:textAlignment w:val="top"/>
-      <w:outlineLvl w:val="0"/>
-    </w:pPr>
-    <w:rPr>
-      <w:b/>
-      <w:position w:val="-1"/>
-      <w:sz w:val="32"/>
-      <w:szCs w:val="20"/>
-      <w:lang w:eastAsia="zh-CN"/>
-    </w:rPr>
-  </w:style>
-  <w:style w:type="character" w:customStyle="1" w:styleId="WW8Num1z0">
-    <w:name w:val="WW8Num1z0"/>
-    <w:rPr>
-      <w:rFonts w:ascii="Symbol" w:hAnsi="Symbol" w:cs="Symbol" w:hint="default"/>
-      <w:w w:val="100"/>
-      <w:position w:val="-1"/>
-      <w:effect w:val="none"/>
-      <w:vertAlign w:val="baseline"/>
-      <w:cs w:val="0"/>
-      <w:em w:val="none"/>
-    </w:rPr>
-  </w:style>
-  <w:style w:type="paragraph" w:styleId="Corpodetexto">
-    <w:name w:val="Body Text"/>
-    <w:basedOn w:val="Normal"/>
-    <w:pPr>
-      <w:spacing w:after="140" w:line="276" w:lineRule="auto"/>
-      <w:ind w:leftChars="-1" w:left="-1" w:hangingChars="1" w:hanging="1"/>
-      <w:textDirection w:val="btLr"/>
-      <w:textAlignment w:val="top"/>
-      <w:outlineLvl w:val="0"/>
-    </w:pPr>
-    <w:rPr>
-      <w:position w:val="-1"/>
-      <w:lang w:eastAsia="zh-CN"/>
-    </w:rPr>
-  </w:style>
-  <w:style w:type="paragraph" w:styleId="Lista">
-    <w:name w:val="List"/>
-    <w:basedOn w:val="Corpodetexto"/>
-    <w:rPr>
-      <w:rFonts w:cs="Noto Sans Devanagari"/>
-    </w:rPr>
-  </w:style>
-  <w:style w:type="paragraph" w:styleId="Legenda">
-    <w:name w:val="caption"/>
-    <w:basedOn w:val="Normal"/>
-    <w:pPr>
-      <w:suppressLineNumbers/>
-      <w:spacing w:before="120" w:after="120" w:line="1" w:lineRule="atLeast"/>
-      <w:ind w:leftChars="-1" w:left="-1" w:hangingChars="1" w:hanging="1"/>
-      <w:textDirection w:val="btLr"/>
-      <w:textAlignment w:val="top"/>
-      <w:outlineLvl w:val="0"/>
-    </w:pPr>
-    <w:rPr>
-      <w:rFonts w:cs="Noto Sans Devanagari"/>
-      <w:i/>
-      <w:iCs/>
-      <w:position w:val="-1"/>
-      <w:lang w:eastAsia="zh-CN"/>
-    </w:rPr>
-  </w:style>
-  <w:style w:type="paragraph" w:customStyle="1" w:styleId="ndice">
-    <w:name w:val="Índice"/>
-    <w:basedOn w:val="Normal"/>
-    <w:pPr>
-      <w:suppressLineNumbers/>
-      <w:spacing w:line="1" w:lineRule="atLeast"/>
-      <w:ind w:leftChars="-1" w:left="-1" w:hangingChars="1" w:hanging="1"/>
-      <w:textDirection w:val="btLr"/>
-      <w:textAlignment w:val="top"/>
-      <w:outlineLvl w:val="0"/>
-    </w:pPr>
-    <w:rPr>
-      <w:rFonts w:cs="Noto Sans Devanagari"/>
-      <w:position w:val="-1"/>
-      <w:lang w:eastAsia="zh-CN"/>
-    </w:rPr>
-  </w:style>
-  <w:style w:type="paragraph" w:customStyle="1" w:styleId="Caption1">
-    <w:name w:val="Caption1"/>
-    <w:basedOn w:val="Normal"/>
-    <w:pPr>
-      <w:suppressLineNumbers/>
-      <w:spacing w:before="120" w:after="120" w:line="1" w:lineRule="atLeast"/>
-      <w:ind w:leftChars="-1" w:left="-1" w:hangingChars="1" w:hanging="1"/>
-      <w:textDirection w:val="btLr"/>
-      <w:textAlignment w:val="top"/>
-      <w:outlineLvl w:val="0"/>
-    </w:pPr>
-    <w:rPr>
-      <w:rFonts w:cs="Noto Sans Devanagari"/>
-      <w:i/>
-      <w:iCs/>
-      <w:position w:val="-1"/>
-      <w:lang w:eastAsia="zh-CN"/>
-    </w:rPr>
-  </w:style>
-  <w:style w:type="paragraph" w:customStyle="1" w:styleId="Caption11">
-    <w:name w:val="Caption11"/>
-    <w:basedOn w:val="Normal"/>
-    <w:pPr>
-      <w:suppressLineNumbers/>
-      <w:spacing w:before="120" w:after="120" w:line="1" w:lineRule="atLeast"/>
-      <w:ind w:leftChars="-1" w:left="-1" w:hangingChars="1" w:hanging="1"/>
-      <w:textDirection w:val="btLr"/>
-      <w:textAlignment w:val="top"/>
-      <w:outlineLvl w:val="0"/>
-    </w:pPr>
-    <w:rPr>
-      <w:rFonts w:cs="Noto Sans Devanagari"/>
-      <w:i/>
-      <w:iCs/>
-      <w:position w:val="-1"/>
-      <w:lang w:eastAsia="zh-CN"/>
-    </w:rPr>
-  </w:style>
-  <w:style w:type="paragraph" w:styleId="Recuodecorpodetexto">
-    <w:name w:val="Body Text Indent"/>
-    <w:basedOn w:val="Normal"/>
-    <w:pPr>
-      <w:spacing w:line="1" w:lineRule="atLeast"/>
-      <w:ind w:leftChars="-1" w:left="284" w:hangingChars="1" w:hanging="1"/>
-      <w:textDirection w:val="btLr"/>
-      <w:textAlignment w:val="top"/>
-      <w:outlineLvl w:val="0"/>
-    </w:pPr>
-    <w:rPr>
-      <w:position w:val="-1"/>
-      <w:sz w:val="28"/>
-      <w:szCs w:val="20"/>
-      <w:lang w:eastAsia="zh-CN"/>
-    </w:rPr>
-  </w:style>
-  <w:style w:type="paragraph" w:customStyle="1" w:styleId="Contedodatabela">
-    <w:name w:val="Conteúdo da tabela"/>
-    <w:basedOn w:val="Normal"/>
-    <w:pPr>
-      <w:widowControl w:val="0"/>
-      <w:suppressLineNumbers/>
-      <w:spacing w:line="1" w:lineRule="atLeast"/>
-      <w:ind w:leftChars="-1" w:left="-1" w:hangingChars="1" w:hanging="1"/>
-      <w:textDirection w:val="btLr"/>
-      <w:textAlignment w:val="top"/>
-      <w:outlineLvl w:val="0"/>
-    </w:pPr>
-    <w:rPr>
-      <w:position w:val="-1"/>
-      <w:lang w:eastAsia="zh-CN"/>
-    </w:rPr>
-  </w:style>
-  <w:style w:type="paragraph" w:customStyle="1" w:styleId="Ttulodetabela">
-    <w:name w:val="Título de tabela"/>
-    <w:basedOn w:val="Contedodatabela"/>
-    <w:pPr>
-      <w:jc w:val="center"/>
-    </w:pPr>
-    <w:rPr>
-      <w:b/>
-      <w:bCs/>
-    </w:rPr>
-  </w:style>
-  <w:style w:type="paragraph" w:styleId="Subttulo">
-    <w:name w:val="Subtitle"/>
-    <w:basedOn w:val="Normal"/>
-    <w:next w:val="Normal"/>
-    <w:uiPriority w:val="11"/>
-    <w:qFormat/>
-    <w:pPr>
-      <w:keepNext/>
-      <w:keepLines/>
-      <w:spacing w:before="360" w:after="80"/>
-    </w:pPr>
-    <w:rPr>
-      <w:rFonts w:ascii="Georgia" w:eastAsia="Georgia" w:hAnsi="Georgia" w:cs="Georgia"/>
-      <w:i/>
-      <w:color w:val="666666"/>
-      <w:sz w:val="48"/>
-      <w:szCs w:val="48"/>
-    </w:rPr>
-  </w:style>
-  <w:style w:type="table" w:customStyle="1" w:styleId="a">
-    <w:basedOn w:val="TableNormal"/>
-    <w:tblPr>
-      <w:tblStyleRowBandSize w:val="1"/>
-      <w:tblStyleColBandSize w:val="1"/>
-      <w:tblCellMar>
-        <w:left w:w="70" w:type="dxa"/>
-        <w:right w:w="70" w:type="dxa"/>
-      </w:tblCellMar>
-    </w:tblPr>
-  </w:style>
-  <w:style w:type="table" w:customStyle="1" w:styleId="a0">
-    <w:basedOn w:val="TableNormal"/>
-    <w:tblPr>
-      <w:tblStyleRowBandSize w:val="1"/>
-      <w:tblStyleColBandSize w:val="1"/>
-      <w:tblCellMar>
-        <w:left w:w="70" w:type="dxa"/>
-        <w:right w:w="70" w:type="dxa"/>
-      </w:tblCellMar>
-    </w:tblPr>
-  </w:style>
-  <w:style w:type="table" w:customStyle="1" w:styleId="a1">
-    <w:basedOn w:val="TableNormal"/>
-    <w:tblPr>
-      <w:tblStyleRowBandSize w:val="1"/>
-      <w:tblStyleColBandSize w:val="1"/>
-      <w:tblCellMar>
-        <w:left w:w="70" w:type="dxa"/>
-        <w:right w:w="70" w:type="dxa"/>
-      </w:tblCellMar>
-    </w:tblPr>
-  </w:style>
-  <w:style w:type="table" w:customStyle="1" w:styleId="a2">
-    <w:basedOn w:val="TableNormal"/>
-    <w:tblPr>
-      <w:tblStyleRowBandSize w:val="1"/>
-      <w:tblStyleColBandSize w:val="1"/>
-      <w:tblCellMar>
-        <w:left w:w="70" w:type="dxa"/>
-        <w:right w:w="70" w:type="dxa"/>
-      </w:tblCellMar>
-    </w:tblPr>
-  </w:style>
-  <w:style w:type="table" w:customStyle="1" w:styleId="a3">
-    <w:basedOn w:val="TableNormal"/>
-    <w:tblPr>
-      <w:tblStyleRowBandSize w:val="1"/>
-      <w:tblStyleColBandSize w:val="1"/>
-      <w:tblCellMar>
-        <w:left w:w="108" w:type="dxa"/>
-        <w:right w:w="108" w:type="dxa"/>
-      </w:tblCellMar>
-    </w:tblPr>
-  </w:style>
 </w:styles>
 </file>
 
 <file path=word/theme/theme1.xml><?xml version="1.0" encoding="utf-8"?>
-<a:theme xmlns:a="http://schemas.openxmlformats.org/drawingml/2006/main" name="Office Theme">
+<a:theme xmlns:a="http://schemas.openxmlformats.org/drawingml/2006/main" xmlns:r="http://schemas.openxmlformats.org/officeDocument/2006/relationships" name="Office Theme">
   <a:themeElements>
     <a:clrScheme name="Office">
       <a:dk1>
-        <a:sysClr val="windowText" lastClr="000000"/>
+        <a:srgbClr val="000000"/>
       </a:dk1>
       <a:lt1>
-        <a:sysClr val="window" lastClr="FFFFFF"/>
+        <a:srgbClr val="ffffff"/>
       </a:lt1>
       <a:dk2>
-        <a:srgbClr val="1F497D"/>
+        <a:srgbClr val="1f497d"/>
       </a:dk2>
       <a:lt2>
-        <a:srgbClr val="EEECE1"/>
+        <a:srgbClr val="eeece1"/>
       </a:lt2>
       <a:accent1>
-        <a:srgbClr val="4F81BD"/>
+        <a:srgbClr val="4f81bd"/>
       </a:accent1>
       <a:accent2>
-        <a:srgbClr val="C0504D"/>
+        <a:srgbClr val="c0504d"/>
       </a:accent2>
       <a:accent3>
-        <a:srgbClr val="9BBB59"/>
+        <a:srgbClr val="9bbb59"/>
       </a:accent3>
       <a:accent4>
-        <a:srgbClr val="8064A2"/>
+        <a:srgbClr val="8064a2"/>
       </a:accent4>
       <a:accent5>
-        <a:srgbClr val="4BACC6"/>
+        <a:srgbClr val="4bacc6"/>
       </a:accent5>
       <a:accent6>
-        <a:srgbClr val="F79646"/>
+        <a:srgbClr val="f79646"/>
       </a:accent6>
       <a:hlink>
-        <a:srgbClr val="0000FF"/>
+        <a:srgbClr val="0000ff"/>
       </a:hlink>
       <a:folHlink>
         <a:srgbClr val="800080"/>
@@ -3397,286 +4298,138 @@
     </a:clrScheme>
     <a:fontScheme name="Office">
       <a:majorFont>
-        <a:latin typeface="Calibri"/>
+        <a:latin typeface="Calibri" pitchFamily="0" charset="1"/>
         <a:ea typeface=""/>
         <a:cs typeface=""/>
-        <a:font script="Jpan" typeface="ＭＳ ゴシック"/>
-        <a:font script="Hang" typeface="맑은 고딕"/>
-        <a:font script="Hans" typeface="宋体"/>
-        <a:font script="Hant" typeface="新細明體"/>
-        <a:font script="Arab" typeface="Times New Roman"/>
-        <a:font script="Hebr" typeface="Times New Roman"/>
-        <a:font script="Thai" typeface="Angsana New"/>
-        <a:font script="Ethi" typeface="Nyala"/>
-        <a:font script="Beng" typeface="Vrinda"/>
-        <a:font script="Gujr" typeface="Shruti"/>
-        <a:font script="Khmr" typeface="MoolBoran"/>
-        <a:font script="Knda" typeface="Tunga"/>
-        <a:font script="Guru" typeface="Raavi"/>
-        <a:font script="Cans" typeface="Euphemia"/>
-        <a:font script="Cher" typeface="Plantagenet Cherokee"/>
-        <a:font script="Yiii" typeface="Microsoft Yi Baiti"/>
-        <a:font script="Tibt" typeface="Microsoft Himalaya"/>
-        <a:font script="Thaa" typeface="MV Boli"/>
-        <a:font script="Deva" typeface="Mangal"/>
-        <a:font script="Telu" typeface="Gautami"/>
-        <a:font script="Taml" typeface="Latha"/>
-        <a:font script="Syrc" typeface="Estrangelo Edessa"/>
-        <a:font script="Orya" typeface="Kalinga"/>
-        <a:font script="Mlym" typeface="Kartika"/>
-        <a:font script="Laoo" typeface="DokChampa"/>
-        <a:font script="Sinh" typeface="Iskoola Pota"/>
-        <a:font script="Mong" typeface="Mongolian Baiti"/>
-        <a:font script="Viet" typeface="Times New Roman"/>
-        <a:font script="Uigh" typeface="Microsoft Uighur"/>
-        <a:font script="Geor" typeface="Sylfaen"/>
       </a:majorFont>
       <a:minorFont>
-        <a:latin typeface="Cambria"/>
+        <a:latin typeface="Cambria" pitchFamily="0" charset="1"/>
         <a:ea typeface=""/>
         <a:cs typeface=""/>
-        <a:font script="Jpan" typeface="ＭＳ 明朝"/>
-        <a:font script="Hang" typeface="맑은 고딕"/>
-        <a:font script="Hans" typeface="宋体"/>
-        <a:font script="Hant" typeface="新細明體"/>
-        <a:font script="Arab" typeface="Arial"/>
-        <a:font script="Hebr" typeface="Arial"/>
-        <a:font script="Thai" typeface="Cordia New"/>
-        <a:font script="Ethi" typeface="Nyala"/>
-        <a:font script="Beng" typeface="Vrinda"/>
-        <a:font script="Gujr" typeface="Shruti"/>
-        <a:font script="Khmr" typeface="DaunPenh"/>
-        <a:font script="Knda" typeface="Tunga"/>
-        <a:font script="Guru" typeface="Raavi"/>
-        <a:font script="Cans" typeface="Euphemia"/>
-        <a:font script="Cher" typeface="Plantagenet Cherokee"/>
-        <a:font script="Yiii" typeface="Microsoft Yi Baiti"/>
-        <a:font script="Tibt" typeface="Microsoft Himalaya"/>
-        <a:font script="Thaa" typeface="MV Boli"/>
-        <a:font script="Deva" typeface="Mangal"/>
-        <a:font script="Telu" typeface="Gautami"/>
-        <a:font script="Taml" typeface="Latha"/>
-        <a:font script="Syrc" typeface="Estrangelo Edessa"/>
-        <a:font script="Orya" typeface="Kalinga"/>
-        <a:font script="Mlym" typeface="Kartika"/>
-        <a:font script="Laoo" typeface="DokChampa"/>
-        <a:font script="Sinh" typeface="Iskoola Pota"/>
-        <a:font script="Mong" typeface="Mongolian Baiti"/>
-        <a:font script="Viet" typeface="Arial"/>
-        <a:font script="Uigh" typeface="Microsoft Uighur"/>
-        <a:font script="Geor" typeface="Sylfaen"/>
       </a:minorFont>
     </a:fontScheme>
-    <a:fmtScheme name="Office">
+    <a:fmtScheme>
       <a:fillStyleLst>
         <a:solidFill>
           <a:schemeClr val="phClr"/>
         </a:solidFill>
-        <a:gradFill rotWithShape="1">
+        <a:gradFill>
           <a:gsLst>
             <a:gs pos="0">
               <a:schemeClr val="phClr">
                 <a:tint val="50000"/>
-                <a:satMod val="300000"/>
               </a:schemeClr>
             </a:gs>
             <a:gs pos="35000">
               <a:schemeClr val="phClr">
                 <a:tint val="37000"/>
-                <a:satMod val="300000"/>
               </a:schemeClr>
             </a:gs>
             <a:gs pos="100000">
               <a:schemeClr val="phClr">
                 <a:tint val="15000"/>
-                <a:satMod val="350000"/>
               </a:schemeClr>
             </a:gs>
           </a:gsLst>
           <a:lin ang="16200000" scaled="1"/>
+          <a:tileRect l="0" t="0" r="0" b="0"/>
         </a:gradFill>
-        <a:gradFill rotWithShape="1">
+        <a:gradFill>
           <a:gsLst>
             <a:gs pos="0">
               <a:schemeClr val="phClr">
                 <a:tint val="100000"/>
                 <a:shade val="100000"/>
-                <a:satMod val="130000"/>
               </a:schemeClr>
             </a:gs>
             <a:gs pos="100000">
               <a:schemeClr val="phClr">
                 <a:tint val="50000"/>
                 <a:shade val="100000"/>
-                <a:satMod val="350000"/>
               </a:schemeClr>
             </a:gs>
           </a:gsLst>
           <a:lin ang="16200000" scaled="0"/>
+          <a:tileRect l="0" t="0" r="0" b="0"/>
         </a:gradFill>
       </a:fillStyleLst>
       <a:lnStyleLst>
         <a:ln w="9525" cap="flat" cmpd="sng" algn="ctr">
-          <a:solidFill>
-            <a:schemeClr val="phClr">
-              <a:shade val="95000"/>
-              <a:satMod val="105000"/>
-            </a:schemeClr>
-          </a:solidFill>
           <a:prstDash val="solid"/>
         </a:ln>
         <a:ln w="25400" cap="flat" cmpd="sng" algn="ctr">
-          <a:solidFill>
-            <a:schemeClr val="phClr"/>
-          </a:solidFill>
           <a:prstDash val="solid"/>
         </a:ln>
         <a:ln w="38100" cap="flat" cmpd="sng" algn="ctr">
-          <a:solidFill>
-            <a:schemeClr val="phClr"/>
-          </a:solidFill>
           <a:prstDash val="solid"/>
         </a:ln>
       </a:lnStyleLst>
       <a:effectStyleLst>
         <a:effectStyle>
-          <a:effectLst>
-            <a:outerShdw blurRad="40000" dist="20000" dir="5400000" rotWithShape="0">
-              <a:srgbClr val="000000">
-                <a:alpha val="38000"/>
-              </a:srgbClr>
-            </a:outerShdw>
-          </a:effectLst>
+          <a:effectLst/>
         </a:effectStyle>
         <a:effectStyle>
-          <a:effectLst>
-            <a:outerShdw blurRad="40000" dist="23000" dir="5400000" rotWithShape="0">
-              <a:srgbClr val="000000">
-                <a:alpha val="35000"/>
-              </a:srgbClr>
-            </a:outerShdw>
-          </a:effectLst>
+          <a:effectLst/>
         </a:effectStyle>
         <a:effectStyle>
-          <a:effectLst>
-            <a:outerShdw blurRad="40000" dist="23000" dir="5400000" rotWithShape="0">
-              <a:srgbClr val="000000">
-                <a:alpha val="35000"/>
-              </a:srgbClr>
-            </a:outerShdw>
-          </a:effectLst>
-          <a:scene3d>
-            <a:camera prst="orthographicFront">
-              <a:rot lat="0" lon="0" rev="0"/>
-            </a:camera>
-            <a:lightRig rig="threePt" dir="t">
-              <a:rot lat="0" lon="0" rev="1200000"/>
-            </a:lightRig>
-          </a:scene3d>
-          <a:sp3d>
-            <a:bevelT w="63500" h="25400"/>
-          </a:sp3d>
+          <a:effectLst/>
         </a:effectStyle>
       </a:effectStyleLst>
       <a:bgFillStyleLst>
         <a:solidFill>
           <a:schemeClr val="phClr"/>
         </a:solidFill>
-        <a:gradFill rotWithShape="1">
+        <a:gradFill>
           <a:gsLst>
             <a:gs pos="0">
               <a:schemeClr val="phClr">
                 <a:tint val="40000"/>
-                <a:satMod val="350000"/>
               </a:schemeClr>
             </a:gs>
             <a:gs pos="40000">
               <a:schemeClr val="phClr">
                 <a:tint val="45000"/>
                 <a:shade val="99000"/>
-                <a:satMod val="350000"/>
               </a:schemeClr>
             </a:gs>
             <a:gs pos="100000">
               <a:schemeClr val="phClr">
                 <a:shade val="20000"/>
-                <a:satMod val="255000"/>
               </a:schemeClr>
             </a:gs>
           </a:gsLst>
           <a:path path="circle">
             <a:fillToRect l="50000" t="-80000" r="50000" b="180000"/>
           </a:path>
+          <a:tileRect l="0" t="0" r="0" b="0"/>
         </a:gradFill>
-        <a:gradFill rotWithShape="1">
+        <a:gradFill>
           <a:gsLst>
             <a:gs pos="0">
               <a:schemeClr val="phClr">
                 <a:tint val="80000"/>
-                <a:satMod val="300000"/>
               </a:schemeClr>
             </a:gs>
             <a:gs pos="100000">
               <a:schemeClr val="phClr">
                 <a:shade val="30000"/>
-                <a:satMod val="200000"/>
               </a:schemeClr>
             </a:gs>
           </a:gsLst>
           <a:path path="circle">
             <a:fillToRect l="50000" t="50000" r="50000" b="50000"/>
           </a:path>
+          <a:tileRect l="0" t="0" r="0" b="0"/>
         </a:gradFill>
       </a:bgFillStyleLst>
     </a:fmtScheme>
   </a:themeElements>
-  <a:objectDefaults>
-    <a:spDef>
-      <a:spPr/>
-      <a:bodyPr/>
-      <a:lstStyle/>
-      <a:style>
-        <a:lnRef idx="1">
-          <a:schemeClr val="accent1"/>
-        </a:lnRef>
-        <a:fillRef idx="3">
-          <a:schemeClr val="accent1"/>
-        </a:fillRef>
-        <a:effectRef idx="2">
-          <a:schemeClr val="accent1"/>
-        </a:effectRef>
-        <a:fontRef idx="minor">
-          <a:schemeClr val="lt1"/>
-        </a:fontRef>
-      </a:style>
-    </a:spDef>
-    <a:lnDef>
-      <a:spPr/>
-      <a:bodyPr/>
-      <a:lstStyle/>
-      <a:style>
-        <a:lnRef idx="2">
-          <a:schemeClr val="accent1"/>
-        </a:lnRef>
-        <a:fillRef idx="0">
-          <a:schemeClr val="accent1"/>
-        </a:fillRef>
-        <a:effectRef idx="1">
-          <a:schemeClr val="accent1"/>
-        </a:effectRef>
-        <a:fontRef idx="minor">
-          <a:schemeClr val="tx1"/>
-        </a:fontRef>
-      </a:style>
-    </a:lnDef>
-  </a:objectDefaults>
-  <a:extraClrSchemeLst/>
 </a:theme>
 </file>
 
 <file path=customXml/item1.xml><?xml version="1.0" encoding="utf-8"?>
 <go:gDocsCustomXmlDataStorage xmlns:go="http://customooxmlschemas.google.com/" xmlns:r="http://schemas.openxmlformats.org/officeDocument/2006/relationships" uri="GoogleDocsCustomDataVersion2">
-  <go:docsCustomData xmlns:go="http://customooxmlschemas.google.com/" roundtripDataSignature="AMtx7mhJ0rwHNKwpZN1iCq6VOyWmgKU2Mg==">CgMxLjAyDmgudXpweWN6YXpxY3JwOAByITFNcjB2LU5KVGRyRU80UnBac3VvbXhpWEtRcmNxbG1yQg==</go:docsCustomData>
+  <go:docsCustomData roundtripDataSignature="AMtx7mhJ0rwHNKwpZN1iCq6VOyWmgKU2Mg==">CgMxLjAyDmgudXpweWN6YXpxY3JwOAByITFNcjB2LU5KVGRyRU80UnBac3VvbXhpWEtRcmNxbG1yQg==</go:docsCustomData>
 </go:gDocsCustomXmlDataStorage>
 </file>
 

</xml_diff>